<commit_message>
Add English pair-energy architecture assets
</commit_message>
<xml_diff>
--- a/ENERGY_MODEL_ARCHITECTURE.docx
+++ b/ENERGY_MODEL_ARCHITECTURE.docx
@@ -12,7 +12,7 @@
           <w:color w:val="0B2545"/>
           <w:sz w:val="44"/>
         </w:rPr>
-        <w:t>Архитектура pair-energy RNN модели</w:t>
+        <w:t>Pair-energy RNN model architecture</w:t>
       </w:r>
     </w:p>
     <w:p>
@@ -24,48 +24,13 @@
           <w:color w:val="555555"/>
           <w:sz w:val="24"/>
         </w:rPr>
-        <w:t>CrystalPairEnergyRNNNet в pipeline-</w:t>
+        <w:t>CrystalPairEnergyRNNNet in the crystal_rnn pipeline branch</w:t>
       </w:r>
       <w:proofErr w:type="spellStart"/>
-      <w:r>
-        <w:rPr>
-          <w:color w:val="555555"/>
-          <w:sz w:val="24"/>
-        </w:rPr>
-        <w:t>ветке</w:t>
-      </w:r>
       <w:proofErr w:type="spellEnd"/>
-      <w:r>
-        <w:rPr>
-          <w:color w:val="555555"/>
-          <w:sz w:val="24"/>
-        </w:rPr>
-        <w:t xml:space="preserve"> </w:t>
-      </w:r>
       <w:proofErr w:type="spellStart"/>
-      <w:r>
-        <w:rPr>
-          <w:color w:val="555555"/>
-          <w:sz w:val="24"/>
-        </w:rPr>
-        <w:t>проекта</w:t>
-      </w:r>
       <w:proofErr w:type="spellEnd"/>
-      <w:r>
-        <w:rPr>
-          <w:color w:val="555555"/>
-          <w:sz w:val="24"/>
-        </w:rPr>
-        <w:t xml:space="preserve"> </w:t>
-      </w:r>
       <w:proofErr w:type="spellStart"/>
-      <w:r>
-        <w:rPr>
-          <w:color w:val="555555"/>
-          <w:sz w:val="24"/>
-        </w:rPr>
-        <w:t>crystal_rnn</w:t>
-      </w:r>
       <w:proofErr w:type="spellEnd"/>
     </w:p>
     <w:tbl>
@@ -97,102 +62,17 @@
                 <w:lang w:val="ru-RU"/>
               </w:rPr>
             </w:pPr>
+            <w:proofErr w:type="spellStart"/>
+            <w:proofErr w:type="spellEnd"/>
             <w:r>
               <w:rPr>
                 <w:b/>
-                <w:lang w:val="ru-RU"/>
               </w:rPr>
-              <w:t>Ключевая идея</w:t>
+              <w:t>Key idea</w:t>
             </w:r>
             <w:r>
-              <w:rPr>
-                <w:lang w:val="ru-RU"/>
-              </w:rPr>
               <w:br/>
-              <w:t xml:space="preserve">Модель не </w:t>
-            </w:r>
-            <w:r>
-              <w:rPr>
-                <w:lang w:val="ru-RU"/>
-              </w:rPr>
-              <w:t xml:space="preserve">предсказывает силу напрямую. Общая </w:t>
-            </w:r>
-            <w:r>
-              <w:t>RNN</w:t>
-            </w:r>
-            <w:r>
-              <w:rPr>
-                <w:lang w:val="ru-RU"/>
-              </w:rPr>
-              <w:t xml:space="preserve">-сеть применяется к истории относительных </w:t>
-            </w:r>
-            <w:r>
-              <w:rPr>
-                <w:lang w:val="ru-RU"/>
-              </w:rPr>
-              <w:t>векторов</w:t>
-            </w:r>
-            <w:r>
-              <w:rPr>
-                <w:lang w:val="ru-RU"/>
-              </w:rPr>
-              <w:t xml:space="preserve"> положений</w:t>
-            </w:r>
-            <w:r>
-              <w:rPr>
-                <w:lang w:val="ru-RU"/>
-              </w:rPr>
-              <w:t xml:space="preserve"> атомных пар и выдает скалярную локальную </w:t>
-            </w:r>
-            <w:r>
-              <w:rPr>
-                <w:lang w:val="ru-RU"/>
-              </w:rPr>
-              <w:t>парную энергию (энергию взаимодействия)</w:t>
-            </w:r>
-            <w:r>
-              <w:rPr>
-                <w:lang w:val="ru-RU"/>
-              </w:rPr>
-              <w:t xml:space="preserve">. Ускорения получаются дифференцированием этой энергии по текущим </w:t>
-            </w:r>
-            <w:r>
-              <w:rPr>
-                <w:lang w:val="ru-RU"/>
-              </w:rPr>
-              <w:t xml:space="preserve">векторам, а при полном </w:t>
-            </w:r>
-            <w:proofErr w:type="spellStart"/>
-            <w:r>
-              <w:rPr>
-                <w:lang w:val="ru-RU"/>
-              </w:rPr>
-              <w:t>инференсе</w:t>
-            </w:r>
-            <w:proofErr w:type="spellEnd"/>
-            <w:r>
-              <w:rPr>
-                <w:lang w:val="ru-RU"/>
-              </w:rPr>
-              <w:t xml:space="preserve"> вклад </w:t>
-            </w:r>
-            <w:r>
-              <w:rPr>
-                <w:lang w:val="ru-RU"/>
-              </w:rPr>
-              <w:t xml:space="preserve">пары </w:t>
-            </w:r>
-            <w:r>
-              <w:rPr>
-                <w:lang w:val="ru-RU"/>
-              </w:rPr>
-              <w:t>распределяется</w:t>
-            </w:r>
-            <w:r>
-              <w:rPr>
-                <w:lang w:val="ru-RU"/>
-              </w:rPr>
-              <w:t xml:space="preserve"> на два атома с противоположными знаками.</w:t>
+              <w:t>The model does not predict force directly. A shared RNN is applied to the history of relative atomic-pair position vectors and outputs a scalar local pair energy (interaction energy). Accelerations are obtained by differentiating this energy with respect to the current vectors; during full inference, the pair contribution is distributed to the two atoms with opposite signs.</w:t>
             </w:r>
           </w:p>
         </w:tc>
@@ -210,28 +90,13 @@
         <w:pStyle w:val="1"/>
       </w:pPr>
       <w:r>
-        <w:t xml:space="preserve">1. </w:t>
+        <w:t>1. Where the code lives</w:t>
       </w:r>
       <w:proofErr w:type="spellStart"/>
-      <w:r>
-        <w:t>Где</w:t>
-      </w:r>
       <w:proofErr w:type="spellEnd"/>
-      <w:r>
-        <w:t xml:space="preserve"> </w:t>
-      </w:r>
       <w:proofErr w:type="spellStart"/>
-      <w:r>
-        <w:t>находится</w:t>
-      </w:r>
       <w:proofErr w:type="spellEnd"/>
-      <w:r>
-        <w:t xml:space="preserve"> </w:t>
-      </w:r>
       <w:proofErr w:type="spellStart"/>
-      <w:r>
-        <w:t>код</w:t>
-      </w:r>
       <w:proofErr w:type="spellEnd"/>
     </w:p>
     <w:tbl>
@@ -263,7 +128,7 @@
               <w:rPr>
                 <w:b/>
               </w:rPr>
-              <w:t>Компонент</w:t>
+              <w:t>Component</w:t>
             </w:r>
           </w:p>
         </w:tc>
@@ -283,7 +148,7 @@
               <w:rPr>
                 <w:b/>
               </w:rPr>
-              <w:t>Файл</w:t>
+              <w:t>File</w:t>
             </w:r>
           </w:p>
         </w:tc>
@@ -303,7 +168,7 @@
               <w:rPr>
                 <w:b/>
               </w:rPr>
-              <w:t>Роль</w:t>
+              <w:t>Role</w:t>
             </w:r>
           </w:p>
         </w:tc>
@@ -361,34 +226,7 @@
               <w:rPr>
                 <w:lang w:val="ru-RU"/>
               </w:rPr>
-              <w:t xml:space="preserve">Основной класс </w:t>
-            </w:r>
-            <w:r>
-              <w:t>energy</w:t>
-            </w:r>
-            <w:r>
-              <w:rPr>
-                <w:lang w:val="ru-RU"/>
-              </w:rPr>
-              <w:t xml:space="preserve"> модели; наследует интерфейс </w:t>
-            </w:r>
-            <w:r>
-              <w:t>pair</w:t>
-            </w:r>
-            <w:r>
-              <w:rPr>
-                <w:lang w:val="ru-RU"/>
-              </w:rPr>
-              <w:t>-</w:t>
-            </w:r>
-            <w:r>
-              <w:t>force</w:t>
-            </w:r>
-            <w:r>
-              <w:rPr>
-                <w:lang w:val="ru-RU"/>
-              </w:rPr>
-              <w:t xml:space="preserve"> модели.</w:t>
+              <w:t>Main energy-model class; inherits the pair-force model interface.</w:t>
             </w:r>
           </w:p>
         </w:tc>
@@ -443,7 +281,7 @@
           </w:tcPr>
           <w:p>
             <w:r>
-              <w:t>Внутренняя RNN, возвращающая orientation-even scalar pair energy.</w:t>
+              <w:t>Internal RNN returning orientation-even scalar pair energy.</w:t>
             </w:r>
           </w:p>
         </w:tc>
@@ -501,54 +339,12 @@
               <w:rPr>
                 <w:lang w:val="ru-RU"/>
               </w:rPr>
-              <w:t xml:space="preserve">Поиск моделей, обучение, </w:t>
-            </w:r>
-            <w:r>
-              <w:rPr>
-                <w:lang w:val="ru-RU"/>
-              </w:rPr>
-              <w:t xml:space="preserve">оценка </w:t>
-            </w:r>
-            <w:r>
-              <w:t>S</w:t>
-            </w:r>
-            <w:r>
-              <w:rPr>
-                <w:lang w:val="ru-RU"/>
-              </w:rPr>
-              <w:t>(</w:t>
+              <w:t>Model search, training, S(q,w) evaluation, and .pth saving.</w:t>
             </w:r>
             <w:proofErr w:type="gramStart"/>
-            <w:r>
-              <w:t>q</w:t>
-            </w:r>
-            <w:r>
-              <w:rPr>
-                <w:lang w:val="ru-RU"/>
-              </w:rPr>
-              <w:t>,</w:t>
-            </w:r>
-            <w:r>
-              <w:t>w</w:t>
-            </w:r>
             <w:proofErr w:type="gramEnd"/>
-            <w:r>
-              <w:rPr>
-                <w:lang w:val="ru-RU"/>
-              </w:rPr>
-              <w:t>), сохранение .</w:t>
-            </w:r>
             <w:proofErr w:type="spellStart"/>
-            <w:r>
-              <w:t>pth</w:t>
-            </w:r>
             <w:proofErr w:type="spellEnd"/>
-            <w:r>
-              <w:rPr>
-                <w:lang w:val="ru-RU"/>
-              </w:rPr>
-              <w:t>.</w:t>
-            </w:r>
           </w:p>
         </w:tc>
       </w:tr>
@@ -605,91 +401,7 @@
               </w:rPr>
             </w:pPr>
             <w:r>
-              <w:t>ASE</w:t>
-            </w:r>
-            <w:r>
-              <w:rPr>
-                <w:lang w:val="ru-RU"/>
-              </w:rPr>
-              <w:t xml:space="preserve">-калькулятор: перевод дискретных ускорений в </w:t>
-            </w:r>
-            <w:r>
-              <w:rPr>
-                <w:lang w:val="ru-RU"/>
-              </w:rPr>
-              <w:t xml:space="preserve">силы для </w:t>
-            </w:r>
-            <w:r>
-              <w:t>ASE</w:t>
-            </w:r>
-            <w:r>
-              <w:rPr>
-                <w:lang w:val="ru-RU"/>
-              </w:rPr>
-              <w:t xml:space="preserve"> </w:t>
-            </w:r>
-            <w:r>
-              <w:rPr>
-                <w:lang w:val="ru-RU"/>
-              </w:rPr>
-              <w:t xml:space="preserve">и выдача </w:t>
-            </w:r>
-            <w:r>
-              <w:t>E</w:t>
-            </w:r>
-            <w:r>
-              <w:rPr>
-                <w:lang w:val="ru-RU"/>
-              </w:rPr>
-              <w:t>_</w:t>
-            </w:r>
-            <w:r>
-              <w:t>pot</w:t>
-            </w:r>
-            <w:r>
-              <w:rPr>
-                <w:lang w:val="ru-RU"/>
-              </w:rPr>
-              <w:t xml:space="preserve"> </w:t>
-            </w:r>
-            <w:r>
-              <w:rPr>
-                <w:lang w:val="ru-RU"/>
-              </w:rPr>
-              <w:t>(</w:t>
-            </w:r>
-            <w:r>
-              <w:rPr>
-                <w:lang w:val="ru-RU"/>
-              </w:rPr>
-              <w:t xml:space="preserve">фактически выход </w:t>
-            </w:r>
-            <w:r>
-              <w:t>RNN</w:t>
-            </w:r>
-            <w:r>
-              <w:rPr>
-                <w:lang w:val="ru-RU"/>
-              </w:rPr>
-              <w:t xml:space="preserve"> </w:t>
-            </w:r>
-            <w:r>
-              <w:rPr>
-                <w:lang w:val="ru-RU"/>
-              </w:rPr>
-              <w:t>слоя</w:t>
-            </w:r>
-            <w:r>
-              <w:rPr>
-                <w:lang w:val="ru-RU"/>
-              </w:rPr>
-              <w:t>)</w:t>
-            </w:r>
-            <w:r>
-              <w:rPr>
-                <w:lang w:val="ru-RU"/>
-              </w:rPr>
-              <w:t>.</w:t>
+              <w:t>ASE calculator: converts discrete accelerations into ASE forces and reports E_pot (effectively the RNN-layer output).</w:t>
             </w:r>
           </w:p>
         </w:tc>
@@ -744,57 +456,12 @@
               </w:rPr>
             </w:pPr>
             <w:r>
-              <w:t>NVT</w:t>
-            </w:r>
-            <w:r>
-              <w:rPr>
-                <w:lang w:val="ru-RU"/>
-              </w:rPr>
-              <w:t>-</w:t>
+              <w:t>NVT inference through the ASE Bussi thermostat and trajectory/diagnostic output.</w:t>
             </w:r>
             <w:proofErr w:type="spellStart"/>
-            <w:r>
-              <w:rPr>
-                <w:lang w:val="ru-RU"/>
-              </w:rPr>
-              <w:t>инференс</w:t>
-            </w:r>
             <w:proofErr w:type="spellEnd"/>
-            <w:r>
-              <w:rPr>
-                <w:lang w:val="ru-RU"/>
-              </w:rPr>
-              <w:t xml:space="preserve"> через </w:t>
-            </w:r>
-            <w:r>
-              <w:t>ASE</w:t>
-            </w:r>
-            <w:r>
-              <w:rPr>
-                <w:lang w:val="ru-RU"/>
-              </w:rPr>
-              <w:t xml:space="preserve"> </w:t>
-            </w:r>
             <w:proofErr w:type="spellStart"/>
-            <w:r>
-              <w:t>Bussi</w:t>
-            </w:r>
             <w:proofErr w:type="spellEnd"/>
-            <w:r>
-              <w:rPr>
-                <w:lang w:val="ru-RU"/>
-              </w:rPr>
-              <w:t xml:space="preserve"> </w:t>
-            </w:r>
-            <w:r>
-              <w:t>thermostat</w:t>
-            </w:r>
-            <w:r>
-              <w:rPr>
-                <w:lang w:val="ru-RU"/>
-              </w:rPr>
-              <w:t xml:space="preserve"> и запись траектории/диагностик.</w:t>
-            </w:r>
           </w:p>
         </w:tc>
       </w:tr>
@@ -811,20 +478,11 @@
         <w:pStyle w:val="1"/>
       </w:pPr>
       <w:r>
-        <w:t xml:space="preserve">2. </w:t>
+        <w:t>2. Physical parameterization</w:t>
       </w:r>
       <w:proofErr w:type="spellStart"/>
-      <w:r>
-        <w:t>Физическая</w:t>
-      </w:r>
       <w:proofErr w:type="spellEnd"/>
-      <w:r>
-        <w:t xml:space="preserve"> </w:t>
-      </w:r>
       <w:proofErr w:type="spellStart"/>
-      <w:r>
-        <w:t>параметризация</w:t>
-      </w:r>
       <w:proofErr w:type="spellEnd"/>
     </w:p>
     <w:p>
@@ -838,19 +496,7 @@
         <w:rPr>
           <w:lang w:val="ru-RU"/>
         </w:rPr>
-        <w:t>Вход</w:t>
-      </w:r>
-      <w:r>
-        <w:rPr>
-          <w:lang w:val="ru-RU"/>
-        </w:rPr>
-        <w:t xml:space="preserve"> модели строится не из абсолютных координат, а из относительных </w:t>
-      </w:r>
-      <w:r>
-        <w:rPr>
-          <w:lang w:val="ru-RU"/>
-        </w:rPr>
-        <w:t>векторов между центральным атомом и его соседями.</w:t>
+        <w:t>The model input is built from relative vectors between the central atom and its neighbors, not from absolute coordinates.</w:t>
       </w:r>
     </w:p>
     <w:p>
@@ -864,68 +510,7 @@
         <w:rPr>
           <w:lang w:val="ru-RU"/>
         </w:rPr>
-        <w:lastRenderedPageBreak/>
-        <w:t xml:space="preserve">Соседи задаются </w:t>
-      </w:r>
-      <w:r>
-        <w:rPr>
-          <w:lang w:val="ru-RU"/>
-        </w:rPr>
-        <w:t>по равновесным положениям в локальном 3</w:t>
-      </w:r>
-      <w:r>
-        <w:t>x</w:t>
-      </w:r>
-      <w:r>
-        <w:rPr>
-          <w:lang w:val="ru-RU"/>
-        </w:rPr>
-        <w:t>3</w:t>
-      </w:r>
-      <w:r>
-        <w:t>x</w:t>
-      </w:r>
-      <w:r>
-        <w:rPr>
-          <w:lang w:val="ru-RU"/>
-        </w:rPr>
-        <w:t>3 блоке</w:t>
-      </w:r>
-      <w:r>
-        <w:rPr>
-          <w:lang w:val="ru-RU"/>
-        </w:rPr>
-        <w:t xml:space="preserve"> (он для обучения)</w:t>
-      </w:r>
-      <w:r>
-        <w:rPr>
-          <w:lang w:val="ru-RU"/>
-        </w:rPr>
-        <w:t xml:space="preserve">. Для текущей </w:t>
-      </w:r>
-      <w:r>
-        <w:t>Cu</w:t>
-      </w:r>
-      <w:r>
-        <w:rPr>
-          <w:lang w:val="ru-RU"/>
-        </w:rPr>
-        <w:t xml:space="preserve"> </w:t>
-      </w:r>
-      <w:r>
-        <w:t>FCC</w:t>
-      </w:r>
-      <w:r>
-        <w:rPr>
-          <w:lang w:val="ru-RU"/>
-        </w:rPr>
-        <w:t xml:space="preserve"> схемы </w:t>
-      </w:r>
-      <w:r>
-        <w:rPr>
-          <w:lang w:val="ru-RU"/>
-        </w:rPr>
-        <w:t>используется две координационные оболочки: 12 ближайших и 6 следующих соседей, всего 18 соседей на атом.</w:t>
+        <w:t>Neighbors are defined from equilibrium positions in the local 3x3x3 block used for training. For the current Cu FCC scheme, two coordination shells are used: 12 nearest neighbors and 6 next-shell neighbors, 18 neighbors per atom in total.</w:t>
       </w:r>
     </w:p>
     <w:p>
@@ -939,55 +524,7 @@
         <w:rPr>
           <w:lang w:val="ru-RU"/>
         </w:rPr>
-        <w:t xml:space="preserve">Для каждого атома элементарной ячейки строится история </w:t>
-      </w:r>
-      <w:r>
-        <w:rPr>
-          <w:lang w:val="ru-RU"/>
-        </w:rPr>
-        <w:t xml:space="preserve">векторов. При </w:t>
-      </w:r>
-      <w:r>
-        <w:t>unit</w:t>
-      </w:r>
-      <w:r>
-        <w:rPr>
-          <w:lang w:val="ru-RU"/>
-        </w:rPr>
-        <w:t>_</w:t>
-      </w:r>
-      <w:r>
-        <w:t>cell</w:t>
-      </w:r>
-      <w:r>
-        <w:rPr>
-          <w:lang w:val="ru-RU"/>
-        </w:rPr>
-        <w:t>_</w:t>
-      </w:r>
-      <w:r>
-        <w:t>atoms</w:t>
-      </w:r>
-      <w:r>
-        <w:rPr>
-          <w:lang w:val="ru-RU"/>
-        </w:rPr>
-        <w:t xml:space="preserve"> = 4 это 4 </w:t>
-      </w:r>
-      <w:r>
-        <w:t>x</w:t>
-      </w:r>
-      <w:r>
-        <w:rPr>
-          <w:lang w:val="ru-RU"/>
-        </w:rPr>
-        <w:t xml:space="preserve"> 18 независимых ориентированных пар на локальный б</w:t>
-      </w:r>
-      <w:r>
-        <w:rPr>
-          <w:lang w:val="ru-RU"/>
-        </w:rPr>
-        <w:t>лок.</w:t>
+        <w:t>For each unit-cell atom, the model builds a vector history. With unit_cell_atoms = 4, this gives 4 x 18 independent oriented pairs per local block.</w:t>
       </w:r>
     </w:p>
     <w:p>
@@ -1001,22 +538,7 @@
         <w:rPr>
           <w:lang w:val="ru-RU"/>
         </w:rPr>
-        <w:t>В</w:t>
-      </w:r>
-      <w:r>
-        <w:rPr>
-          <w:lang w:val="ru-RU"/>
-        </w:rPr>
-        <w:t xml:space="preserve">ектор нормируется на параметр решетки </w:t>
-      </w:r>
-      <w:r>
-        <w:t>a</w:t>
-      </w:r>
-      <w:r>
-        <w:rPr>
-          <w:lang w:val="ru-RU"/>
-        </w:rPr>
-        <w:t>0, поэтому входные признаки имеют безразмерный масштаб порядка единицы.</w:t>
+        <w:t>Each vector is normalized by the lattice parameter a0, so the input features have a dimensionless scale of order one.</w:t>
       </w:r>
     </w:p>
     <w:tbl>
@@ -1049,7 +571,7 @@
               <w:rPr>
                 <w:b/>
               </w:rPr>
-              <w:t>Величина</w:t>
+              <w:t>Quantity</w:t>
             </w:r>
             <w:proofErr w:type="spellEnd"/>
           </w:p>
@@ -1070,7 +592,7 @@
               <w:rPr>
                 <w:b/>
               </w:rPr>
-              <w:t>Форма / значение</w:t>
+              <w:t>Shape / value</w:t>
             </w:r>
           </w:p>
         </w:tc>
@@ -1090,7 +612,7 @@
               <w:rPr>
                 <w:b/>
               </w:rPr>
-              <w:t>Смысл</w:t>
+              <w:t>Meaning</w:t>
             </w:r>
           </w:p>
         </w:tc>
@@ -1148,25 +670,7 @@
               <w:rPr>
                 <w:lang w:val="ru-RU"/>
               </w:rPr>
-              <w:t>История смещений локального 3</w:t>
-            </w:r>
-            <w:r>
-              <w:t>x</w:t>
-            </w:r>
-            <w:r>
-              <w:rPr>
-                <w:lang w:val="ru-RU"/>
-              </w:rPr>
-              <w:t>3</w:t>
-            </w:r>
-            <w:r>
-              <w:t>x</w:t>
-            </w:r>
-            <w:r>
-              <w:rPr>
-                <w:lang w:val="ru-RU"/>
-              </w:rPr>
-              <w:t>3 блока.</w:t>
+              <w:t>Local 3x3x3 block displacement history.</w:t>
             </w:r>
           </w:p>
         </w:tc>
@@ -1220,28 +724,13 @@
           <w:p>
             <w:proofErr w:type="spellStart"/>
             <w:r>
-              <w:t>История</w:t>
+              <w:t>History of relative vectors.</w:t>
             </w:r>
             <w:proofErr w:type="spellEnd"/>
-            <w:r>
-              <w:t xml:space="preserve"> </w:t>
-            </w:r>
             <w:proofErr w:type="spellStart"/>
-            <w:r>
-              <w:t>относительных</w:t>
-            </w:r>
             <w:proofErr w:type="spellEnd"/>
-            <w:r>
-              <w:t xml:space="preserve"> </w:t>
-            </w:r>
             <w:proofErr w:type="spellStart"/>
-            <w:r>
-              <w:t>векторов</w:t>
-            </w:r>
             <w:proofErr w:type="spellEnd"/>
-            <w:r>
-              <w:t>.</w:t>
-            </w:r>
           </w:p>
         </w:tc>
       </w:tr>
@@ -1298,16 +787,7 @@
               <w:rPr>
                 <w:lang w:val="ru-RU"/>
               </w:rPr>
-              <w:t xml:space="preserve">Форма, подаваемая во внутреннюю </w:t>
-            </w:r>
-            <w:r>
-              <w:t>RNN</w:t>
-            </w:r>
-            <w:r>
-              <w:rPr>
-                <w:lang w:val="ru-RU"/>
-              </w:rPr>
-              <w:t>.</w:t>
+              <w:t>Shape passed into the internal RNN.</w:t>
             </w:r>
           </w:p>
         </w:tc>
@@ -1326,16 +806,10 @@
           <w:p>
             <w:proofErr w:type="spellStart"/>
             <w:r>
-              <w:t>текущий</w:t>
+              <w:t>current mode</w:t>
             </w:r>
             <w:proofErr w:type="spellEnd"/>
-            <w:r>
-              <w:t xml:space="preserve"> </w:t>
-            </w:r>
             <w:proofErr w:type="spellStart"/>
-            <w:r>
-              <w:t>режим</w:t>
-            </w:r>
             <w:proofErr w:type="spellEnd"/>
           </w:p>
         </w:tc>
@@ -1368,31 +842,13 @@
           <w:p>
             <w:proofErr w:type="spellStart"/>
             <w:r>
-              <w:t>Фактическая</w:t>
+              <w:t>Actual working Cu333 configuration.</w:t>
             </w:r>
             <w:proofErr w:type="spellEnd"/>
-            <w:r>
-              <w:t xml:space="preserve"> </w:t>
-            </w:r>
             <w:proofErr w:type="spellStart"/>
-            <w:r>
-              <w:t>рабочая</w:t>
-            </w:r>
             <w:proofErr w:type="spellEnd"/>
-            <w:r>
-              <w:t xml:space="preserve"> Cu</w:t>
-            </w:r>
-            <w:r>
-              <w:t xml:space="preserve">333 </w:t>
-            </w:r>
             <w:proofErr w:type="spellStart"/>
-            <w:r>
-              <w:t>конфигурация</w:t>
-            </w:r>
             <w:proofErr w:type="spellEnd"/>
-            <w:r>
-              <w:t>.</w:t>
-            </w:r>
           </w:p>
         </w:tc>
       </w:tr>
@@ -1403,124 +859,19 @@
         <w:pStyle w:val="1"/>
       </w:pPr>
       <w:r>
-        <w:t>3. Внутренняя RNN-сеть</w:t>
+        <w:t>3. Internal RNN network</w:t>
       </w:r>
     </w:p>
     <w:p>
       <w:r>
-        <w:t xml:space="preserve">Внутри CrystalPairEnergyRNNNet используется _EvenPairEnergyRNN. Она применяет один общий recurrent-блок к каждой ориентированной паре. Тип recurrent-блока выбирается параметром: RNN, GRU или LSTM. </w:t>
-      </w:r>
-      <w:r>
-        <w:rPr>
-          <w:lang w:val="ru-RU"/>
-        </w:rPr>
-        <w:t>Сейчас</w:t>
-      </w:r>
-      <w:r>
-        <w:t xml:space="preserve"> </w:t>
-      </w:r>
-      <w:r>
-        <w:rPr>
-          <w:lang w:val="ru-RU"/>
-        </w:rPr>
-        <w:t>проверялся</w:t>
-      </w:r>
-      <w:r>
-        <w:t xml:space="preserve"> </w:t>
-      </w:r>
-      <w:r>
-        <w:rPr>
-          <w:lang w:val="ru-RU"/>
-        </w:rPr>
-        <w:t>в</w:t>
-      </w:r>
-      <w:r>
-        <w:t xml:space="preserve"> </w:t>
-      </w:r>
-      <w:r>
-        <w:rPr>
-          <w:lang w:val="ru-RU"/>
-        </w:rPr>
-        <w:t>основном</w:t>
-      </w:r>
-      <w:r>
-        <w:t xml:space="preserve"> </w:t>
-      </w:r>
-      <w:r>
-        <w:rPr>
-          <w:lang w:val="ru-RU"/>
-        </w:rPr>
-        <w:t>режим</w:t>
-      </w:r>
-      <w:r>
-        <w:t xml:space="preserve"> RNN, bidirectional=True, </w:t>
+        <w:t>Inside CrystalPairEnergyRNNNet, _EvenPairEnergyRNN is used. It applies one shared recurrent block to every oriented pair. The recurrent block type is selected by parameter: RNN, GRU, or LSTM. The mode tested most often so far is RNN, bidirectional=True, hidden_size=128, rnn_layers=1, and readout_mode=final-hidden (the network output readout).</w:t>
       </w:r>
       <w:proofErr w:type="spellStart"/>
-      <w:r>
-        <w:t>hidden_size</w:t>
-      </w:r>
       <w:proofErr w:type="spellEnd"/>
-      <w:r>
-        <w:t xml:space="preserve">=128, </w:t>
-      </w:r>
       <w:proofErr w:type="spellStart"/>
-      <w:r>
-        <w:t>rnn_layers</w:t>
-      </w:r>
       <w:proofErr w:type="spellEnd"/>
-      <w:r>
-        <w:t xml:space="preserve">=1 и </w:t>
-      </w:r>
       <w:proofErr w:type="spellStart"/>
-      <w:r>
-        <w:t>readout_mode</w:t>
-      </w:r>
       <w:proofErr w:type="spellEnd"/>
-      <w:r>
-        <w:t>=final-hidden</w:t>
-      </w:r>
-      <w:r>
-        <w:t xml:space="preserve"> (</w:t>
-      </w:r>
-      <w:r>
-        <w:rPr>
-          <w:lang w:val="ru-RU"/>
-        </w:rPr>
-        <w:t>что</w:t>
-      </w:r>
-      <w:r>
-        <w:t xml:space="preserve"> </w:t>
-      </w:r>
-      <w:r>
-        <w:rPr>
-          <w:lang w:val="ru-RU"/>
-        </w:rPr>
-        <w:t>на</w:t>
-      </w:r>
-      <w:r>
-        <w:t xml:space="preserve"> </w:t>
-      </w:r>
-      <w:r>
-        <w:rPr>
-          <w:lang w:val="ru-RU"/>
-        </w:rPr>
-        <w:t>выходе</w:t>
-      </w:r>
-      <w:r>
-        <w:t xml:space="preserve"> </w:t>
-      </w:r>
-      <w:r>
-        <w:rPr>
-          <w:lang w:val="ru-RU"/>
-        </w:rPr>
-        <w:t>сети</w:t>
-      </w:r>
-      <w:r>
-        <w:t>)</w:t>
-      </w:r>
-      <w:r>
-        <w:t>.</w:t>
-      </w:r>
     </w:p>
     <w:p/>
     <w:tbl>
@@ -1552,7 +903,7 @@
               <w:rPr>
                 <w:b/>
               </w:rPr>
-              <w:t>Слой</w:t>
+              <w:t>Layer</w:t>
             </w:r>
           </w:p>
         </w:tc>
@@ -1572,7 +923,7 @@
               <w:rPr>
                 <w:b/>
               </w:rPr>
-              <w:t>Форма</w:t>
+              <w:t>Shape</w:t>
             </w:r>
           </w:p>
         </w:tc>
@@ -1592,7 +943,7 @@
               <w:rPr>
                 <w:b/>
               </w:rPr>
-              <w:t>Описание</w:t>
+              <w:t>Description</w:t>
             </w:r>
           </w:p>
         </w:tc>
@@ -1650,16 +1001,7 @@
               <w:rPr>
                 <w:lang w:val="ru-RU"/>
               </w:rPr>
-              <w:t xml:space="preserve">Обрабатывает историю относительного </w:t>
-            </w:r>
-            <w:r>
-              <w:t>pair</w:t>
-            </w:r>
-            <w:r>
-              <w:rPr>
-                <w:lang w:val="ru-RU"/>
-              </w:rPr>
-              <w:t>-вектора.</w:t>
+              <w:t>Processes the relative pair-vector history.</w:t>
             </w:r>
           </w:p>
         </w:tc>
@@ -1693,7 +1035,7 @@
           </w:tcPr>
           <w:p>
             <w:r>
-              <w:t>last-output или final-hidden</w:t>
+              <w:t>last-output or final-hidden</w:t>
             </w:r>
           </w:p>
         </w:tc>
@@ -1709,7 +1051,7 @@
           </w:tcPr>
           <w:p>
             <w:r>
-              <w:t>Для best energy модели используется final-hidden; при bidirectional склеиваются forward/backward hidden states.</w:t>
+              <w:t>For the best energy model, final-hidden is used; with bidirectional=True, forward/backward hidden states are concatenated.</w:t>
             </w:r>
           </w:p>
         </w:tc>
@@ -1760,7 +1102,7 @@
           </w:tcPr>
           <w:p>
             <w:r>
-              <w:t>Первый слой MLP-head.</w:t>
+              <w:t>First MLP-head layer.</w:t>
             </w:r>
           </w:p>
         </w:tc>
@@ -1810,7 +1152,7 @@
           </w:tcPr>
           <w:p>
             <w:r>
-              <w:t>Нелинейность в head.</w:t>
+              <w:t>Head nonlinearity.</w:t>
             </w:r>
           </w:p>
         </w:tc>
@@ -1860,7 +1202,7 @@
           </w:tcPr>
           <w:p>
             <w:r>
-              <w:t>Скалярная raw pair-energy.</w:t>
+              <w:t>Scalar raw pair energy.</w:t>
             </w:r>
           </w:p>
         </w:tc>
@@ -1872,7 +1214,7 @@
         <w:pStyle w:val="1"/>
       </w:pPr>
       <w:r>
-        <w:t>4. Even-симметрия энергии</w:t>
+        <w:t>4. Even symmetry of the energy</w:t>
       </w:r>
     </w:p>
     <w:p>
@@ -1885,31 +1227,10 @@
         <w:rPr>
           <w:lang w:val="ru-RU"/>
         </w:rPr>
-        <w:t xml:space="preserve">Чтобы энергия пары не зависела от выбранной ориентации пары, сеть явно </w:t>
+        <w:t>To make the pair energy independent of the chosen pair orientation, the network is explicitly symmetrized under pair-vector reversal:</w:t>
       </w:r>
       <w:proofErr w:type="spellStart"/>
-      <w:r>
-        <w:rPr>
-          <w:lang w:val="ru-RU"/>
-        </w:rPr>
-        <w:t>симметризуется</w:t>
-      </w:r>
       <w:proofErr w:type="spellEnd"/>
-      <w:r>
-        <w:rPr>
-          <w:lang w:val="ru-RU"/>
-        </w:rPr>
-        <w:t xml:space="preserve"> по обращению </w:t>
-      </w:r>
-      <w:r>
-        <w:t>pair</w:t>
-      </w:r>
-      <w:r>
-        <w:rPr>
-          <w:lang w:val="ru-RU"/>
-        </w:rPr>
-        <w:t>-вектора:</w:t>
-      </w:r>
     </w:p>
     <w:p>
       <w:pPr>
@@ -1932,61 +1253,10 @@
         <w:rPr>
           <w:lang w:val="ru-RU"/>
         </w:rPr>
-        <w:t xml:space="preserve">Это </w:t>
-      </w:r>
-      <w:r>
-        <w:rPr>
-          <w:lang w:val="ru-RU"/>
-        </w:rPr>
-        <w:t xml:space="preserve">важное отличие от </w:t>
-      </w:r>
-      <w:r>
-        <w:t>pair</w:t>
-      </w:r>
-      <w:r>
-        <w:rPr>
-          <w:lang w:val="ru-RU"/>
-        </w:rPr>
-        <w:t>-</w:t>
-      </w:r>
-      <w:r>
-        <w:t>force</w:t>
-      </w:r>
-      <w:r>
-        <w:rPr>
-          <w:lang w:val="ru-RU"/>
-        </w:rPr>
-        <w:t xml:space="preserve"> модели, где используется нечетная </w:t>
+        <w:t>This is the key difference from the pair-force model, where an odd antisymmetrization of the vector contribution is used. In the energy model, the scalar energy is even, and opposite forces arise after differentiation on the full crystal.</w:t>
       </w:r>
       <w:proofErr w:type="spellStart"/>
-      <w:r>
-        <w:rPr>
-          <w:lang w:val="ru-RU"/>
-        </w:rPr>
-        <w:t>антисимметризация</w:t>
-      </w:r>
       <w:proofErr w:type="spellEnd"/>
-      <w:r>
-        <w:rPr>
-          <w:lang w:val="ru-RU"/>
-        </w:rPr>
-        <w:t xml:space="preserve"> векторного вклада. В </w:t>
-      </w:r>
-      <w:r>
-        <w:t>energy</w:t>
-      </w:r>
-      <w:r>
-        <w:rPr>
-          <w:lang w:val="ru-RU"/>
-        </w:rPr>
-        <w:t xml:space="preserve">-модели скалярная энергия четная, а противоположные силы возникают уже после дифференцирования </w:t>
-      </w:r>
-      <w:r>
-        <w:rPr>
-          <w:lang w:val="ru-RU"/>
-        </w:rPr>
-        <w:t>на полном кристалле.</w:t>
-      </w:r>
     </w:p>
     <w:p>
       <w:pPr>
@@ -1999,13 +1269,7 @@
         <w:rPr>
           <w:lang w:val="ru-RU"/>
         </w:rPr>
-        <w:t>5. Как из энергии</w:t>
-      </w:r>
-      <w:r>
-        <w:rPr>
-          <w:lang w:val="ru-RU"/>
-        </w:rPr>
-        <w:t xml:space="preserve"> получается ускорение</w:t>
+        <w:t>5. How acceleration is obtained from energy</w:t>
       </w:r>
     </w:p>
     <w:p>
@@ -2018,60 +1282,12 @@
         <w:rPr>
           <w:lang w:val="ru-RU"/>
         </w:rPr>
-        <w:t xml:space="preserve">Для каждой пары вычисляется скалярная энергия </w:t>
-      </w:r>
-      <w:r>
-        <w:t>U</w:t>
-      </w:r>
-      <w:r>
-        <w:rPr>
-          <w:lang w:val="ru-RU"/>
-        </w:rPr>
-        <w:t xml:space="preserve">. Затем </w:t>
+        <w:t>For each pair, the scalar energy U is computed. Then PyTorch autograd takes the gradient of the energy sum with respect to the input features. The contribution to the central-atom acceleration is taken from the gradient at the last time layer, i.e. with respect to the current pair vector:</w:t>
       </w:r>
       <w:proofErr w:type="spellStart"/>
-      <w:r>
-        <w:t>PyTorch</w:t>
-      </w:r>
       <w:proofErr w:type="spellEnd"/>
-      <w:r>
-        <w:rPr>
-          <w:lang w:val="ru-RU"/>
-        </w:rPr>
-        <w:t xml:space="preserve"> </w:t>
-      </w:r>
       <w:proofErr w:type="spellStart"/>
-      <w:r>
-        <w:t>autograd</w:t>
-      </w:r>
       <w:proofErr w:type="spellEnd"/>
-      <w:r>
-        <w:rPr>
-          <w:lang w:val="ru-RU"/>
-        </w:rPr>
-        <w:t xml:space="preserve"> берет градиент суммы энергий по входным </w:t>
-      </w:r>
-      <w:r>
-        <w:t>features</w:t>
-      </w:r>
-      <w:r>
-        <w:rPr>
-          <w:lang w:val="ru-RU"/>
-        </w:rPr>
-        <w:t xml:space="preserve">. Вклад в ускорение центрального атома берется из градиента по последнему временному слою, то есть по текущему </w:t>
-      </w:r>
-      <w:r>
-        <w:t>pai</w:t>
-      </w:r>
-      <w:r>
-        <w:t>r</w:t>
-      </w:r>
-      <w:r>
-        <w:rPr>
-          <w:lang w:val="ru-RU"/>
-        </w:rPr>
-        <w:t>-вектору:</w:t>
-      </w:r>
     </w:p>
     <w:p>
       <w:pPr>
@@ -2094,111 +1310,39 @@
         <w:rPr>
           <w:lang w:val="ru-RU"/>
         </w:rPr>
-        <w:t xml:space="preserve">В коде это соответствует </w:t>
+        <w:t>In code this corresponds to gradient[..., -1, :] / lattice_parameter. The central acceleration of the local block is obtained by summing over neighbors. On the full crystal, unique-pair scatter is used: each pair is counted once; one atom receives +a_pair and the other receives -a_pair.</w:t>
       </w:r>
       <w:proofErr w:type="gramStart"/>
-      <w:r>
-        <w:t>gradient</w:t>
-      </w:r>
+      <w:proofErr w:type="gramEnd"/>
+    </w:p>
+    <w:p>
+      <w:pPr>
+        <w:pStyle w:val="a0"/>
+        <w:rPr>
+          <w:lang w:val="ru-RU"/>
+        </w:rPr>
+      </w:pPr>
       <w:r>
         <w:rPr>
           <w:lang w:val="ru-RU"/>
         </w:rPr>
-        <w:t>[</w:t>
+        <w:t>The total system force is zero by construction because pair contributions are scattered with opposite signs.</w:t>
       </w:r>
-      <w:proofErr w:type="gramEnd"/>
+      <w:proofErr w:type="spellStart"/>
+      <w:proofErr w:type="spellEnd"/>
+    </w:p>
+    <w:p>
+      <w:pPr>
+        <w:pStyle w:val="a0"/>
+        <w:rPr>
+          <w:lang w:val="ru-RU"/>
+        </w:rPr>
+      </w:pPr>
       <w:r>
         <w:rPr>
           <w:lang w:val="ru-RU"/>
         </w:rPr>
-        <w:t xml:space="preserve">..., -1, :] / </w:t>
-      </w:r>
-      <w:r>
-        <w:t>lattice</w:t>
-      </w:r>
-      <w:r>
-        <w:rPr>
-          <w:lang w:val="ru-RU"/>
-        </w:rPr>
-        <w:t>_</w:t>
-      </w:r>
-      <w:r>
-        <w:t>parameter</w:t>
-      </w:r>
-      <w:r>
-        <w:rPr>
-          <w:lang w:val="ru-RU"/>
-        </w:rPr>
-        <w:t xml:space="preserve">. Центральное ускорение локального блока получается суммой по соседям. На полном кристалле используется </w:t>
-      </w:r>
-      <w:r>
-        <w:t>unique</w:t>
-      </w:r>
-      <w:r>
-        <w:rPr>
-          <w:lang w:val="ru-RU"/>
-        </w:rPr>
-        <w:t>-</w:t>
-      </w:r>
-      <w:r>
-        <w:t>pair</w:t>
-      </w:r>
-      <w:r>
-        <w:rPr>
-          <w:lang w:val="ru-RU"/>
-        </w:rPr>
-        <w:t xml:space="preserve"> </w:t>
-      </w:r>
-      <w:r>
-        <w:t>scatter</w:t>
-      </w:r>
-      <w:r>
-        <w:rPr>
-          <w:lang w:val="ru-RU"/>
-        </w:rPr>
-        <w:t>: каждая пара учитывается о</w:t>
-      </w:r>
-      <w:r>
-        <w:rPr>
-          <w:lang w:val="ru-RU"/>
-        </w:rPr>
-        <w:t>дин раз, один атом получает +</w:t>
-      </w:r>
-      <w:r>
-        <w:t>a</w:t>
-      </w:r>
-      <w:r>
-        <w:rPr>
-          <w:lang w:val="ru-RU"/>
-        </w:rPr>
-        <w:t>_</w:t>
-      </w:r>
-      <w:r>
-        <w:t>pair</w:t>
-      </w:r>
-      <w:r>
-        <w:rPr>
-          <w:lang w:val="ru-RU"/>
-        </w:rPr>
-        <w:t>, второй -</w:t>
-      </w:r>
-      <w:r>
-        <w:t>a</w:t>
-      </w:r>
-      <w:r>
-        <w:rPr>
-          <w:lang w:val="ru-RU"/>
-        </w:rPr>
-        <w:t>_</w:t>
-      </w:r>
-      <w:r>
-        <w:t>pair</w:t>
-      </w:r>
-      <w:r>
-        <w:rPr>
-          <w:lang w:val="ru-RU"/>
-        </w:rPr>
-        <w:t>.</w:t>
+        <w:t>The field is potential with respect to the current pair features for a fixed history context.</w:t>
       </w:r>
     </w:p>
     <w:p>
@@ -2212,115 +1356,7 @@
         <w:rPr>
           <w:lang w:val="ru-RU"/>
         </w:rPr>
-        <w:t xml:space="preserve">Суммарная сила по системе </w:t>
-      </w:r>
-      <w:proofErr w:type="spellStart"/>
-      <w:r>
-        <w:rPr>
-          <w:lang w:val="ru-RU"/>
-        </w:rPr>
-        <w:t>зануляется</w:t>
-      </w:r>
-      <w:proofErr w:type="spellEnd"/>
-      <w:r>
-        <w:rPr>
-          <w:lang w:val="ru-RU"/>
-        </w:rPr>
-        <w:t xml:space="preserve"> конструктивно, потому что пары рассеиваются с противоположными знаками.</w:t>
-      </w:r>
-    </w:p>
-    <w:p>
-      <w:pPr>
-        <w:pStyle w:val="a0"/>
-        <w:rPr>
-          <w:lang w:val="ru-RU"/>
-        </w:rPr>
-      </w:pPr>
-      <w:r>
-        <w:rPr>
-          <w:lang w:val="ru-RU"/>
-        </w:rPr>
-        <w:t xml:space="preserve">Поле становится потенциальным относительно текущих </w:t>
-      </w:r>
-      <w:r>
-        <w:t>pair</w:t>
-      </w:r>
-      <w:r>
-        <w:rPr>
-          <w:lang w:val="ru-RU"/>
-        </w:rPr>
-        <w:t>-</w:t>
-      </w:r>
-      <w:r>
-        <w:t>features</w:t>
-      </w:r>
-      <w:r>
-        <w:rPr>
-          <w:lang w:val="ru-RU"/>
-        </w:rPr>
-        <w:t xml:space="preserve"> при фиксированном </w:t>
-      </w:r>
-      <w:r>
-        <w:t>history</w:t>
-      </w:r>
-      <w:r>
-        <w:rPr>
-          <w:lang w:val="ru-RU"/>
-        </w:rPr>
-        <w:t xml:space="preserve"> </w:t>
-      </w:r>
-      <w:r>
-        <w:t>con</w:t>
-      </w:r>
-      <w:r>
-        <w:t>text</w:t>
-      </w:r>
-      <w:r>
-        <w:rPr>
-          <w:lang w:val="ru-RU"/>
-        </w:rPr>
-        <w:t>.</w:t>
-      </w:r>
-    </w:p>
-    <w:p>
-      <w:pPr>
-        <w:pStyle w:val="a0"/>
-        <w:rPr>
-          <w:lang w:val="ru-RU"/>
-        </w:rPr>
-      </w:pPr>
-      <w:r>
-        <w:rPr>
-          <w:lang w:val="ru-RU"/>
-        </w:rPr>
-        <w:t xml:space="preserve">Энергия остается </w:t>
-      </w:r>
-      <w:r>
-        <w:t>history</w:t>
-      </w:r>
-      <w:r>
-        <w:rPr>
-          <w:lang w:val="ru-RU"/>
-        </w:rPr>
-        <w:t>-</w:t>
-      </w:r>
-      <w:r>
-        <w:t>dependent</w:t>
-      </w:r>
-      <w:r>
-        <w:rPr>
-          <w:lang w:val="ru-RU"/>
-        </w:rPr>
-        <w:t xml:space="preserve">: </w:t>
-      </w:r>
-      <w:r>
-        <w:t>RNN</w:t>
-      </w:r>
-      <w:r>
-        <w:rPr>
-          <w:lang w:val="ru-RU"/>
-        </w:rPr>
-        <w:t xml:space="preserve"> видит несколько кадров, поэтому это эффективная динамическая энергия, а не статический межатомный потенциал в классическом смысле.</w:t>
+        <w:t>The energy remains history-dependent: the RNN sees several frames, so this is an effective dynamical energy, not a static interatomic potential in the classical sense.</w:t>
       </w:r>
     </w:p>
     <w:p>
@@ -2334,7 +1370,7 @@
         <w:rPr>
           <w:lang w:val="ru-RU"/>
         </w:rPr>
-        <w:t>6. Обучение</w:t>
+        <w:t>6. Training</w:t>
       </w:r>
     </w:p>
     <w:p>
@@ -2347,133 +1383,7 @@
         <w:rPr>
           <w:lang w:val="ru-RU"/>
         </w:rPr>
-        <w:t xml:space="preserve">Обучение идет через тот же интерфейс </w:t>
-      </w:r>
-      <w:r>
-        <w:t>train</w:t>
-      </w:r>
-      <w:r>
-        <w:rPr>
-          <w:lang w:val="ru-RU"/>
-        </w:rPr>
-        <w:t>_</w:t>
-      </w:r>
-      <w:r>
-        <w:t>crystal</w:t>
-      </w:r>
-      <w:r>
-        <w:rPr>
-          <w:lang w:val="ru-RU"/>
-        </w:rPr>
-        <w:t>_</w:t>
-      </w:r>
-      <w:r>
-        <w:t>blocks</w:t>
-      </w:r>
-      <w:r>
-        <w:rPr>
-          <w:lang w:val="ru-RU"/>
-        </w:rPr>
-        <w:t>, что и дл</w:t>
-      </w:r>
-      <w:r>
-        <w:rPr>
-          <w:lang w:val="ru-RU"/>
-        </w:rPr>
-        <w:t xml:space="preserve">я </w:t>
-      </w:r>
-      <w:r>
-        <w:t>pair</w:t>
-      </w:r>
-      <w:r>
-        <w:rPr>
-          <w:lang w:val="ru-RU"/>
-        </w:rPr>
-        <w:t>-</w:t>
-      </w:r>
-      <w:r>
-        <w:t>force</w:t>
-      </w:r>
-      <w:r>
-        <w:rPr>
-          <w:lang w:val="ru-RU"/>
-        </w:rPr>
-        <w:t xml:space="preserve"> режима</w:t>
-      </w:r>
-      <w:r>
-        <w:rPr>
-          <w:lang w:val="ru-RU"/>
-        </w:rPr>
-        <w:t xml:space="preserve">. Для режима </w:t>
-      </w:r>
-      <w:r>
-        <w:t>training</w:t>
-      </w:r>
-      <w:r>
-        <w:rPr>
-          <w:lang w:val="ru-RU"/>
-        </w:rPr>
-        <w:t>_</w:t>
-      </w:r>
-      <w:r>
-        <w:t>target</w:t>
-      </w:r>
-      <w:r>
-        <w:rPr>
-          <w:lang w:val="ru-RU"/>
-        </w:rPr>
-        <w:t>=</w:t>
-      </w:r>
-      <w:r>
-        <w:t>force</w:t>
-      </w:r>
-      <w:r>
-        <w:rPr>
-          <w:lang w:val="ru-RU"/>
-        </w:rPr>
-        <w:t xml:space="preserve"> целевой тензор берется из </w:t>
-      </w:r>
-      <w:r>
-        <w:t>force</w:t>
-      </w:r>
-      <w:r>
-        <w:rPr>
-          <w:lang w:val="ru-RU"/>
-        </w:rPr>
-        <w:t>_</w:t>
-      </w:r>
-      <w:r>
-        <w:t>acceleration</w:t>
-      </w:r>
-      <w:r>
-        <w:rPr>
-          <w:lang w:val="ru-RU"/>
-        </w:rPr>
-        <w:t>_</w:t>
-      </w:r>
-      <w:r>
-        <w:t>blocks</w:t>
-      </w:r>
-      <w:r>
-        <w:rPr>
-          <w:lang w:val="ru-RU"/>
-        </w:rPr>
-        <w:t xml:space="preserve">, то есть из сил </w:t>
-      </w:r>
-      <w:r>
-        <w:t>LAMMPS</w:t>
-      </w:r>
-      <w:r>
-        <w:rPr>
-          <w:lang w:val="ru-RU"/>
-        </w:rPr>
-        <w:t>, переведенных в дискретные ускорения модели. Сама сеть учится не по энергии, а по силам/ускорениям, полученным как градиент ее энергии</w:t>
-      </w:r>
-      <w:r>
-        <w:rPr>
-          <w:lang w:val="ru-RU"/>
-        </w:rPr>
-        <w:t>.</w:t>
+        <w:t>Training uses the same train_crystal_blocks interface as pair-force mode. For training_target=force, the target tensor is taken from force_acceleration_blocks, i.e. from LAMMPS forces converted to model discrete accelerations. The network is not trained on energies directly; it is trained on forces/accelerations obtained as the gradient of its energy.</w:t>
       </w:r>
     </w:p>
     <w:tbl>
@@ -2504,16 +1414,9 @@
               <w:rPr>
                 <w:b/>
               </w:rPr>
-              <w:lastRenderedPageBreak/>
-              <w:t>Loss-</w:t>
+              <w:t>Loss component</w:t>
             </w:r>
             <w:proofErr w:type="spellStart"/>
-            <w:r>
-              <w:rPr>
-                <w:b/>
-              </w:rPr>
-              <w:t>компонент</w:t>
-            </w:r>
             <w:proofErr w:type="spellEnd"/>
           </w:p>
         </w:tc>
@@ -2533,7 +1436,7 @@
               <w:rPr>
                 <w:b/>
               </w:rPr>
-              <w:t>Роль</w:t>
+              <w:t>Role</w:t>
             </w:r>
           </w:p>
         </w:tc>
@@ -2575,16 +1478,7 @@
               <w:rPr>
                 <w:lang w:val="ru-RU"/>
               </w:rPr>
-              <w:t xml:space="preserve">Основная </w:t>
-            </w:r>
-            <w:r>
-              <w:t>MSE</w:t>
-            </w:r>
-            <w:r>
-              <w:rPr>
-                <w:lang w:val="ru-RU"/>
-              </w:rPr>
-              <w:t xml:space="preserve"> ошибка нормализованных ускорений.</w:t>
+              <w:t>Main MSE error of normalized accelerations.</w:t>
             </w:r>
           </w:p>
         </w:tc>
@@ -2628,34 +1522,7 @@
               <w:rPr>
                 <w:lang w:val="ru-RU"/>
               </w:rPr>
-              <w:t>Штрафует сдвиг средней мощности &lt;</w:t>
-            </w:r>
-            <w:r>
-              <w:t>a</w:t>
-            </w:r>
-            <w:r>
-              <w:rPr>
-                <w:lang w:val="ru-RU"/>
-              </w:rPr>
-              <w:t xml:space="preserve"> * </w:t>
-            </w:r>
-            <w:r>
-              <w:t>v</w:t>
-            </w:r>
-            <w:r>
-              <w:rPr>
-                <w:lang w:val="ru-RU"/>
-              </w:rPr>
-              <w:t xml:space="preserve">&gt; относительно </w:t>
-            </w:r>
-            <w:r>
-              <w:t>reference</w:t>
-            </w:r>
-            <w:r>
-              <w:rPr>
-                <w:lang w:val="ru-RU"/>
-              </w:rPr>
-              <w:t>.</w:t>
+              <w:t>Penalizes the mean-power shift &lt;a * v&gt; relative to reference.</w:t>
             </w:r>
           </w:p>
         </w:tc>
@@ -2699,25 +1566,7 @@
               <w:rPr>
                 <w:lang w:val="ru-RU"/>
               </w:rPr>
-              <w:t xml:space="preserve">Штрафует завышение </w:t>
-            </w:r>
-            <w:r>
-              <w:t>RMS</w:t>
-            </w:r>
-            <w:r>
-              <w:rPr>
-                <w:lang w:val="ru-RU"/>
-              </w:rPr>
-              <w:t xml:space="preserve"> ускорений относительно </w:t>
-            </w:r>
-            <w:r>
-              <w:t>reference</w:t>
-            </w:r>
-            <w:r>
-              <w:rPr>
-                <w:lang w:val="ru-RU"/>
-              </w:rPr>
-              <w:t>.</w:t>
+              <w:t>Penalizes overestimated acceleration RMS relative to reference.</w:t>
             </w:r>
           </w:p>
         </w:tc>
@@ -2761,16 +1610,7 @@
               <w:rPr>
                 <w:lang w:val="ru-RU"/>
               </w:rPr>
-              <w:t xml:space="preserve">Мягко штрафует занижение </w:t>
-            </w:r>
-            <w:r>
-              <w:t>RMS</w:t>
-            </w:r>
-            <w:r>
-              <w:rPr>
-                <w:lang w:val="ru-RU"/>
-              </w:rPr>
-              <w:t xml:space="preserve"> ускорений.</w:t>
+              <w:t>Softly penalizes underestimated acceleration RMS.</w:t>
             </w:r>
           </w:p>
         </w:tc>
@@ -2814,52 +1654,10 @@
               <w:rPr>
                 <w:lang w:val="ru-RU"/>
               </w:rPr>
-              <w:t xml:space="preserve">Опциональный </w:t>
-            </w:r>
-            <w:r>
-              <w:t>q</w:t>
-            </w:r>
-            <w:r>
-              <w:rPr>
-                <w:lang w:val="ru-RU"/>
-              </w:rPr>
-              <w:t>-</w:t>
-            </w:r>
-            <w:r>
-              <w:t>resolved</w:t>
-            </w:r>
-            <w:r>
-              <w:rPr>
-                <w:lang w:val="ru-RU"/>
-              </w:rPr>
-              <w:t xml:space="preserve"> штраф мощности; в текущем </w:t>
+              <w:t>Optional q-resolved power penalty; usually disabled in the current preset because it has been nearly unhelpful in practice.</w:t>
             </w:r>
             <w:proofErr w:type="spellStart"/>
-            <w:r>
-              <w:rPr>
-                <w:lang w:val="ru-RU"/>
-              </w:rPr>
-              <w:t>пресете</w:t>
-            </w:r>
             <w:proofErr w:type="spellEnd"/>
-            <w:r>
-              <w:rPr>
-                <w:lang w:val="ru-RU"/>
-              </w:rPr>
-              <w:t xml:space="preserve"> обычно выключен</w:t>
-            </w:r>
-            <w:r>
-              <w:rPr>
-                <w:lang w:val="ru-RU"/>
-              </w:rPr>
-              <w:t xml:space="preserve"> (не помогает почти совершенно)</w:t>
-            </w:r>
-            <w:r>
-              <w:rPr>
-                <w:lang w:val="ru-RU"/>
-              </w:rPr>
-              <w:t>.</w:t>
-            </w:r>
           </w:p>
         </w:tc>
       </w:tr>
@@ -2902,55 +1700,10 @@
               <w:rPr>
                 <w:lang w:val="ru-RU"/>
               </w:rPr>
-              <w:t xml:space="preserve">Опциональный штраф на </w:t>
+              <w:t>Optional non-potentiality penalty; not needed for the energy model because the field is already obtained as an energy gradient and is potential.</w:t>
             </w:r>
             <w:proofErr w:type="spellStart"/>
-            <w:r>
-              <w:rPr>
-                <w:lang w:val="ru-RU"/>
-              </w:rPr>
-              <w:t>непотенциальность</w:t>
-            </w:r>
             <w:proofErr w:type="spellEnd"/>
-            <w:r>
-              <w:rPr>
-                <w:lang w:val="ru-RU"/>
-              </w:rPr>
-              <w:t xml:space="preserve">; для </w:t>
-            </w:r>
-            <w:r>
-              <w:t>energy</w:t>
-            </w:r>
-            <w:r>
-              <w:rPr>
-                <w:lang w:val="ru-RU"/>
-              </w:rPr>
-              <w:t xml:space="preserve"> модели </w:t>
-            </w:r>
-            <w:r>
-              <w:rPr>
-                <w:lang w:val="ru-RU"/>
-              </w:rPr>
-              <w:t>не нужно включать</w:t>
-            </w:r>
-            <w:r>
-              <w:rPr>
-                <w:lang w:val="ru-RU"/>
-              </w:rPr>
-              <w:t>, так как поле уже берется из энергии</w:t>
-            </w:r>
-            <w:r>
-              <w:rPr>
-                <w:lang w:val="ru-RU"/>
-              </w:rPr>
-              <w:t xml:space="preserve"> градиентом и потенциально</w:t>
-            </w:r>
-            <w:r>
-              <w:rPr>
-                <w:lang w:val="ru-RU"/>
-              </w:rPr>
-              <w:t>.</w:t>
-            </w:r>
           </w:p>
         </w:tc>
       </w:tr>
@@ -2965,151 +1718,37 @@
     <w:p>
       <w:proofErr w:type="spellStart"/>
       <w:r>
-        <w:t>Текущий</w:t>
+        <w:t>Current recommended search setup for the pair-energy model: at least 30000 training frames, RNN final-hidden, hidden_size=128, rnn_layers=1, bidirectional, neighbor_shells=2, training_target=force, acceleration_normalization=global, power_mean_loss_weight=0.1, acceleration_over_rms_loss_weight=0.1, acceleration_under_rms_loss_weight=0.01.</w:t>
       </w:r>
       <w:proofErr w:type="spellEnd"/>
-      <w:r>
-        <w:t xml:space="preserve"> </w:t>
-      </w:r>
       <w:proofErr w:type="spellStart"/>
-      <w:r>
-        <w:t>рекомендованный</w:t>
-      </w:r>
       <w:proofErr w:type="spellEnd"/>
-      <w:r>
-        <w:t xml:space="preserve"> </w:t>
-      </w:r>
       <w:proofErr w:type="spellStart"/>
-      <w:r>
-        <w:t>поиск</w:t>
-      </w:r>
       <w:proofErr w:type="spellEnd"/>
-      <w:r>
-        <w:t xml:space="preserve"> </w:t>
-      </w:r>
       <w:proofErr w:type="spellStart"/>
-      <w:r>
-        <w:t>для</w:t>
-      </w:r>
       <w:proofErr w:type="spellEnd"/>
-      <w:r>
-        <w:t xml:space="preserve"> </w:t>
-      </w:r>
-      <w:r>
-        <w:t xml:space="preserve">pair-energy </w:t>
-      </w:r>
       <w:proofErr w:type="spellStart"/>
-      <w:r>
-        <w:t>модели</w:t>
-      </w:r>
       <w:proofErr w:type="spellEnd"/>
-      <w:r>
-        <w:t xml:space="preserve">: </w:t>
-      </w:r>
-      <w:r>
-        <w:rPr>
-          <w:lang w:val="ru-RU"/>
-        </w:rPr>
-        <w:t>не</w:t>
-      </w:r>
-      <w:r>
-        <w:t xml:space="preserve"> </w:t>
-      </w:r>
-      <w:r>
-        <w:rPr>
-          <w:lang w:val="ru-RU"/>
-        </w:rPr>
-        <w:t>менее</w:t>
-      </w:r>
-      <w:r>
-        <w:t xml:space="preserve"> 3</w:t>
-      </w:r>
-      <w:r>
-        <w:t xml:space="preserve">0000 </w:t>
-      </w:r>
       <w:proofErr w:type="spellStart"/>
-      <w:r>
-        <w:t>кадров</w:t>
-      </w:r>
       <w:proofErr w:type="spellEnd"/>
-      <w:r>
-        <w:t xml:space="preserve"> </w:t>
-      </w:r>
       <w:proofErr w:type="spellStart"/>
-      <w:r>
-        <w:t>обучения</w:t>
-      </w:r>
       <w:proofErr w:type="spellEnd"/>
-      <w:r>
-        <w:t xml:space="preserve">, RNN final-hidden, </w:t>
-      </w:r>
       <w:proofErr w:type="spellStart"/>
-      <w:r>
-        <w:t>hidden_size</w:t>
-      </w:r>
       <w:proofErr w:type="spellEnd"/>
-      <w:r>
-        <w:t xml:space="preserve">=128, </w:t>
-      </w:r>
       <w:proofErr w:type="spellStart"/>
-      <w:r>
-        <w:t>rnn_layers</w:t>
-      </w:r>
       <w:proofErr w:type="spellEnd"/>
-      <w:r>
-        <w:t xml:space="preserve">=1, bidirectional, </w:t>
-      </w:r>
       <w:proofErr w:type="spellStart"/>
-      <w:r>
-        <w:t>neighbor_shells</w:t>
-      </w:r>
       <w:proofErr w:type="spellEnd"/>
-      <w:r>
-        <w:t xml:space="preserve">=2, </w:t>
-      </w:r>
       <w:proofErr w:type="spellStart"/>
-      <w:r>
-        <w:t>training_target</w:t>
-      </w:r>
       <w:proofErr w:type="spellEnd"/>
-      <w:r>
-        <w:t xml:space="preserve">=force, </w:t>
-      </w:r>
       <w:proofErr w:type="spellStart"/>
-      <w:r>
-        <w:t>acceleration_normalizat</w:t>
-      </w:r>
-      <w:r>
-        <w:t>ion</w:t>
-      </w:r>
       <w:proofErr w:type="spellEnd"/>
-      <w:r>
-        <w:t xml:space="preserve">=global, </w:t>
-      </w:r>
       <w:proofErr w:type="spellStart"/>
-      <w:r>
-        <w:t>power_mean_loss_weight</w:t>
-      </w:r>
       <w:proofErr w:type="spellEnd"/>
-      <w:r>
-        <w:t xml:space="preserve">=0.1, </w:t>
-      </w:r>
       <w:proofErr w:type="spellStart"/>
-      <w:r>
-        <w:t>acceleration_over_rms_loss_weight</w:t>
-      </w:r>
       <w:proofErr w:type="spellEnd"/>
-      <w:r>
-        <w:t xml:space="preserve">=0.1, </w:t>
-      </w:r>
       <w:proofErr w:type="spellStart"/>
-      <w:r>
-        <w:t>acceleration_under_rms_loss_weight</w:t>
-      </w:r>
       <w:proofErr w:type="spellEnd"/>
-      <w:r>
-        <w:t>=0.01.</w:t>
-      </w:r>
     </w:p>
     <w:p>
       <w:pPr>
@@ -3122,31 +1761,10 @@
         <w:rPr>
           <w:lang w:val="ru-RU"/>
         </w:rPr>
-        <w:t xml:space="preserve">7. </w:t>
-      </w:r>
-      <w:r>
-        <w:t>ASE</w:t>
-      </w:r>
-      <w:r>
-        <w:rPr>
-          <w:lang w:val="ru-RU"/>
-        </w:rPr>
-        <w:t>-</w:t>
+        <w:t>7. ASE inference and energy</w:t>
       </w:r>
       <w:proofErr w:type="spellStart"/>
-      <w:r>
-        <w:rPr>
-          <w:lang w:val="ru-RU"/>
-        </w:rPr>
-        <w:t>инференс</w:t>
-      </w:r>
       <w:proofErr w:type="spellEnd"/>
-      <w:r>
-        <w:rPr>
-          <w:lang w:val="ru-RU"/>
-        </w:rPr>
-        <w:t xml:space="preserve"> и энергия</w:t>
-      </w:r>
     </w:p>
     <w:p>
       <w:pPr>
@@ -3155,118 +1773,7 @@
         </w:rPr>
       </w:pPr>
       <w:r>
-        <w:t>ASE</w:t>
-      </w:r>
-      <w:r>
-        <w:rPr>
-          <w:lang w:val="ru-RU"/>
-        </w:rPr>
-        <w:t xml:space="preserve">-калькулятор определяет </w:t>
-      </w:r>
-      <w:r>
-        <w:t>backend</w:t>
-      </w:r>
-      <w:r>
-        <w:rPr>
-          <w:lang w:val="ru-RU"/>
-        </w:rPr>
-        <w:t xml:space="preserve"> </w:t>
-      </w:r>
-      <w:r>
-        <w:t>pair</w:t>
-      </w:r>
-      <w:r>
-        <w:rPr>
-          <w:lang w:val="ru-RU"/>
-        </w:rPr>
-        <w:t>-</w:t>
-      </w:r>
-      <w:r>
-        <w:t>energy</w:t>
-      </w:r>
-      <w:r>
-        <w:rPr>
-          <w:lang w:val="ru-RU"/>
-        </w:rPr>
-        <w:t xml:space="preserve"> по сохраненному объекту модели. Для каждого шага он поддерживае</w:t>
-      </w:r>
-      <w:r>
-        <w:rPr>
-          <w:lang w:val="ru-RU"/>
-        </w:rPr>
-        <w:t xml:space="preserve">т </w:t>
-      </w:r>
-      <w:r>
-        <w:t>history</w:t>
-      </w:r>
-      <w:r>
-        <w:rPr>
-          <w:lang w:val="ru-RU"/>
-        </w:rPr>
-        <w:t xml:space="preserve"> последних кадров, строит ускорения </w:t>
-      </w:r>
-      <w:r>
-        <w:t>full</w:t>
-      </w:r>
-      <w:r>
-        <w:rPr>
-          <w:lang w:val="ru-RU"/>
-        </w:rPr>
-        <w:t>-</w:t>
-      </w:r>
-      <w:r>
-        <w:t>crystal</w:t>
-      </w:r>
-      <w:r>
-        <w:rPr>
-          <w:lang w:val="ru-RU"/>
-        </w:rPr>
-        <w:t xml:space="preserve"> через </w:t>
-      </w:r>
-      <w:r>
-        <w:t>predict</w:t>
-      </w:r>
-      <w:r>
-        <w:rPr>
-          <w:lang w:val="ru-RU"/>
-        </w:rPr>
-        <w:t>_</w:t>
-      </w:r>
-      <w:r>
-        <w:t>full</w:t>
-      </w:r>
-      <w:r>
-        <w:rPr>
-          <w:lang w:val="ru-RU"/>
-        </w:rPr>
-        <w:t>_</w:t>
-      </w:r>
-      <w:r>
-        <w:t>accelerations</w:t>
-      </w:r>
-      <w:r>
-        <w:rPr>
-          <w:lang w:val="ru-RU"/>
-        </w:rPr>
-        <w:t xml:space="preserve">, затем переводит дискретные ускорения в </w:t>
-      </w:r>
-      <w:r>
-        <w:t>ASE</w:t>
-      </w:r>
-      <w:r>
-        <w:rPr>
-          <w:lang w:val="ru-RU"/>
-        </w:rPr>
-        <w:t xml:space="preserve"> </w:t>
-      </w:r>
-      <w:r>
-        <w:t>forces</w:t>
-      </w:r>
-      <w:r>
-        <w:rPr>
-          <w:lang w:val="ru-RU"/>
-        </w:rPr>
-        <w:t>:</w:t>
+        <w:t>The ASE calculator detects the pair-energy backend from the saved model object. At every step it keeps a history of recent frames, builds full-crystal accelerations through predict_full_accelerations, and then converts discrete accelerations into ASE forces:</w:t>
       </w:r>
     </w:p>
     <w:p>
@@ -3290,240 +1797,12 @@
         <w:rPr>
           <w:lang w:val="ru-RU"/>
         </w:rPr>
-        <w:t xml:space="preserve">Для </w:t>
-      </w:r>
-      <w:r>
-        <w:rPr>
-          <w:lang w:val="ru-RU"/>
-        </w:rPr>
-        <w:t>определения энергии</w:t>
-      </w:r>
-      <w:r>
-        <w:rPr>
-          <w:lang w:val="ru-RU"/>
-        </w:rPr>
-        <w:t xml:space="preserve"> дополнительно вызывается </w:t>
-      </w:r>
-      <w:r>
-        <w:t>predict</w:t>
-      </w:r>
-      <w:r>
-        <w:rPr>
-          <w:lang w:val="ru-RU"/>
-        </w:rPr>
-        <w:t>_</w:t>
-      </w:r>
-      <w:r>
-        <w:t>full</w:t>
-      </w:r>
-      <w:r>
-        <w:rPr>
-          <w:lang w:val="ru-RU"/>
-        </w:rPr>
-        <w:t>_</w:t>
-      </w:r>
-      <w:r>
-        <w:t>potential</w:t>
-      </w:r>
-      <w:r>
-        <w:rPr>
-          <w:lang w:val="ru-RU"/>
-        </w:rPr>
-        <w:t>_</w:t>
-      </w:r>
-      <w:r>
-        <w:t>energy</w:t>
-      </w:r>
-      <w:r>
-        <w:rPr>
-          <w:lang w:val="ru-RU"/>
-        </w:rPr>
-        <w:t xml:space="preserve">: энергии уникальных пар суммируются и переводятся в </w:t>
-      </w:r>
-      <w:r>
-        <w:t>eV</w:t>
-      </w:r>
-      <w:r>
-        <w:rPr>
-          <w:lang w:val="ru-RU"/>
-        </w:rPr>
-        <w:t xml:space="preserve"> тем же масштабом </w:t>
-      </w:r>
-      <w:r>
-        <w:t>mass</w:t>
-      </w:r>
-      <w:r>
-        <w:rPr>
-          <w:lang w:val="ru-RU"/>
-        </w:rPr>
-        <w:t xml:space="preserve"> * (</w:t>
-      </w:r>
-      <w:r>
-        <w:t>amu</w:t>
-      </w:r>
-      <w:r>
-        <w:rPr>
-          <w:lang w:val="ru-RU"/>
-        </w:rPr>
-        <w:t xml:space="preserve"> </w:t>
-      </w:r>
-      <w:r>
-        <w:t>Angstrom</w:t>
-      </w:r>
-      <w:r>
-        <w:rPr>
-          <w:lang w:val="ru-RU"/>
-        </w:rPr>
-        <w:t xml:space="preserve"> / </w:t>
+        <w:t>To define energy, predict_full_potential_energy is called additionally: unique-pair energies are summed and converted to eV using the same scale mass * (amu Angstrom / ps^2 -&gt; eV / Angstrom) / dt^2. Therefore, in postprocessing direct E_tot = E_pot_model + E_kin becomes the main energy diagnostic (identified with the crystal energy).</w:t>
       </w:r>
       <w:proofErr w:type="spellStart"/>
-      <w:r>
-        <w:t>ps</w:t>
-      </w:r>
       <w:proofErr w:type="spellEnd"/>
-      <w:r>
-        <w:rPr>
-          <w:lang w:val="ru-RU"/>
-        </w:rPr>
-        <w:t xml:space="preserve">^2 -&gt; </w:t>
-      </w:r>
-      <w:r>
-        <w:t>eV</w:t>
-      </w:r>
-      <w:r>
-        <w:rPr>
-          <w:lang w:val="ru-RU"/>
-        </w:rPr>
-        <w:t xml:space="preserve"> / </w:t>
-      </w:r>
-      <w:r>
-        <w:t>Angstrom</w:t>
-      </w:r>
-      <w:r>
-        <w:rPr>
-          <w:lang w:val="ru-RU"/>
-        </w:rPr>
-        <w:t xml:space="preserve">) / </w:t>
-      </w:r>
-      <w:r>
-        <w:t>dt</w:t>
-      </w:r>
-      <w:r>
-        <w:rPr>
-          <w:lang w:val="ru-RU"/>
-        </w:rPr>
-        <w:t xml:space="preserve">^2. </w:t>
-      </w:r>
-      <w:r>
-        <w:rPr>
-          <w:lang w:val="ru-RU"/>
-        </w:rPr>
-        <w:t xml:space="preserve">Поэтому в </w:t>
-      </w:r>
       <w:proofErr w:type="spellStart"/>
-      <w:r>
-        <w:rPr>
-          <w:lang w:val="ru-RU"/>
-        </w:rPr>
-        <w:t>постпроцессинге</w:t>
-      </w:r>
       <w:proofErr w:type="spellEnd"/>
-      <w:r>
-        <w:rPr>
-          <w:lang w:val="ru-RU"/>
-        </w:rPr>
-        <w:t xml:space="preserve"> </w:t>
-      </w:r>
-      <w:r>
-        <w:t>direct</w:t>
-      </w:r>
-      <w:r>
-        <w:rPr>
-          <w:lang w:val="ru-RU"/>
-        </w:rPr>
-        <w:t xml:space="preserve"> </w:t>
-      </w:r>
-      <w:r>
-        <w:t>E</w:t>
-      </w:r>
-      <w:r>
-        <w:rPr>
-          <w:lang w:val="ru-RU"/>
-        </w:rPr>
-        <w:t>_</w:t>
-      </w:r>
-      <w:r>
-        <w:t>tot</w:t>
-      </w:r>
-      <w:r>
-        <w:rPr>
-          <w:lang w:val="ru-RU"/>
-        </w:rPr>
-        <w:t xml:space="preserve"> = </w:t>
-      </w:r>
-      <w:r>
-        <w:t>E</w:t>
-      </w:r>
-      <w:r>
-        <w:rPr>
-          <w:lang w:val="ru-RU"/>
-        </w:rPr>
-        <w:t>_</w:t>
-      </w:r>
-      <w:r>
-        <w:t>pot</w:t>
-      </w:r>
-      <w:r>
-        <w:rPr>
-          <w:lang w:val="ru-RU"/>
-        </w:rPr>
-        <w:t>_</w:t>
-      </w:r>
-      <w:r>
-        <w:t>model</w:t>
-      </w:r>
-      <w:r>
-        <w:rPr>
-          <w:lang w:val="ru-RU"/>
-        </w:rPr>
-        <w:t xml:space="preserve"> + </w:t>
-      </w:r>
-      <w:r>
-        <w:t>E</w:t>
-      </w:r>
-      <w:r>
-        <w:rPr>
-          <w:lang w:val="ru-RU"/>
-        </w:rPr>
-        <w:t>_</w:t>
-      </w:r>
-      <w:r>
-        <w:t>kin</w:t>
-      </w:r>
-      <w:r>
-        <w:rPr>
-          <w:lang w:val="ru-RU"/>
-        </w:rPr>
-        <w:t xml:space="preserve"> становится основной энергетической диаг</w:t>
-      </w:r>
-      <w:r>
-        <w:rPr>
-          <w:lang w:val="ru-RU"/>
-        </w:rPr>
-        <w:t>ностикой</w:t>
-      </w:r>
-      <w:r>
-        <w:rPr>
-          <w:lang w:val="ru-RU"/>
-        </w:rPr>
-        <w:t xml:space="preserve"> (отождествляем с энергией кристалла)</w:t>
-      </w:r>
-      <w:r>
-        <w:rPr>
-          <w:lang w:val="ru-RU"/>
-        </w:rPr>
-        <w:t>.</w:t>
-      </w:r>
     </w:p>
     <w:p>
       <w:pPr>
@@ -3536,7 +1815,7 @@
         <w:rPr>
           <w:lang w:val="ru-RU"/>
         </w:rPr>
-        <w:t>8. Что эта архитектура гарантирует и чего нет</w:t>
+        <w:t>8. What this architecture guarantees and what it does not</w:t>
       </w:r>
     </w:p>
     <w:tbl>
@@ -3569,7 +1848,7 @@
               <w:rPr>
                 <w:b/>
               </w:rPr>
-              <w:t>Свойство</w:t>
+              <w:t>Property</w:t>
             </w:r>
             <w:proofErr w:type="spellEnd"/>
           </w:p>
@@ -3590,7 +1869,7 @@
               <w:rPr>
                 <w:b/>
               </w:rPr>
-              <w:t>Статус</w:t>
+              <w:t>Status</w:t>
             </w:r>
           </w:p>
         </w:tc>
@@ -3610,7 +1889,7 @@
               <w:rPr>
                 <w:b/>
               </w:rPr>
-              <w:t>Комментарий</w:t>
+              <w:t>Comment</w:t>
             </w:r>
           </w:p>
         </w:tc>
@@ -3628,7 +1907,7 @@
           </w:tcPr>
           <w:p>
             <w:r>
-              <w:t>Локальность</w:t>
+              <w:t>Locality</w:t>
             </w:r>
           </w:p>
         </w:tc>
@@ -3644,7 +1923,7 @@
           </w:tcPr>
           <w:p>
             <w:r>
-              <w:t>Да</w:t>
+              <w:t>Yes</w:t>
             </w:r>
           </w:p>
         </w:tc>
@@ -3668,25 +1947,7 @@
               <w:rPr>
                 <w:lang w:val="ru-RU"/>
               </w:rPr>
-              <w:t>Модель использует 3</w:t>
-            </w:r>
-            <w:r>
-              <w:t>x</w:t>
-            </w:r>
-            <w:r>
-              <w:rPr>
-                <w:lang w:val="ru-RU"/>
-              </w:rPr>
-              <w:t>3</w:t>
-            </w:r>
-            <w:r>
-              <w:t>x</w:t>
-            </w:r>
-            <w:r>
-              <w:rPr>
-                <w:lang w:val="ru-RU"/>
-              </w:rPr>
-              <w:t>3 блок и две координационные оболочки.</w:t>
+              <w:t>The model uses a 3x3x3 block and two coordination shells.</w:t>
             </w:r>
           </w:p>
         </w:tc>
@@ -3705,17 +1966,10 @@
           <w:p>
             <w:proofErr w:type="spellStart"/>
             <w:r>
-              <w:lastRenderedPageBreak/>
-              <w:t>Инвариантность</w:t>
+              <w:t>Translation invariance</w:t>
             </w:r>
             <w:proofErr w:type="spellEnd"/>
-            <w:r>
-              <w:t xml:space="preserve"> к </w:t>
-            </w:r>
             <w:proofErr w:type="spellStart"/>
-            <w:r>
-              <w:t>переносу</w:t>
-            </w:r>
             <w:proofErr w:type="spellEnd"/>
           </w:p>
         </w:tc>
@@ -3731,7 +1985,7 @@
           </w:tcPr>
           <w:p>
             <w:r>
-              <w:t>Да</w:t>
+              <w:t>Yes</w:t>
             </w:r>
           </w:p>
         </w:tc>
@@ -3755,25 +2009,7 @@
               <w:rPr>
                 <w:lang w:val="ru-RU"/>
               </w:rPr>
-              <w:t xml:space="preserve">Входы - относительные </w:t>
-            </w:r>
-            <w:r>
-              <w:rPr>
-                <w:lang w:val="ru-RU"/>
-              </w:rPr>
-              <w:t xml:space="preserve">парные </w:t>
-            </w:r>
-            <w:r>
-              <w:rPr>
-                <w:lang w:val="ru-RU"/>
-              </w:rPr>
-              <w:t xml:space="preserve">векторы, абсолютные </w:t>
-            </w:r>
-            <w:r>
-              <w:rPr>
-                <w:lang w:val="ru-RU"/>
-              </w:rPr>
-              <w:t>координаты не подаются.</w:t>
+              <w:t>Inputs are relative pair vectors; absolute coordinates are not provided.</w:t>
             </w:r>
           </w:p>
         </w:tc>
@@ -3799,7 +2035,7 @@
               <w:rPr>
                 <w:lang w:val="ru-RU"/>
               </w:rPr>
-              <w:t>Третий закон Ньютона</w:t>
+              <w:t>Newton's third law</w:t>
             </w:r>
           </w:p>
         </w:tc>
@@ -3816,24 +2052,12 @@
           <w:p>
             <w:proofErr w:type="spellStart"/>
             <w:r>
-              <w:t>Да</w:t>
+              <w:t>Yes with pair_scatter</w:t>
             </w:r>
             <w:proofErr w:type="spellEnd"/>
-            <w:r>
-              <w:t xml:space="preserve"> </w:t>
-            </w:r>
             <w:proofErr w:type="spellStart"/>
-            <w:r>
-              <w:t>при</w:t>
-            </w:r>
             <w:proofErr w:type="spellEnd"/>
-            <w:r>
-              <w:t xml:space="preserve"> </w:t>
-            </w:r>
             <w:proofErr w:type="spellStart"/>
-            <w:r>
-              <w:t>pair_scatter</w:t>
-            </w:r>
             <w:proofErr w:type="spellEnd"/>
           </w:p>
         </w:tc>
@@ -3857,7 +2081,7 @@
               <w:rPr>
                 <w:lang w:val="ru-RU"/>
               </w:rPr>
-              <w:t>Одна пара дает противоположные вклады двум атомам.</w:t>
+              <w:t>One pair gives opposite contributions to two atoms.</w:t>
             </w:r>
           </w:p>
         </w:tc>
@@ -3876,24 +2100,12 @@
           <w:p>
             <w:proofErr w:type="spellStart"/>
             <w:r>
-              <w:t>Нулевая</w:t>
+              <w:t>Zero total force</w:t>
             </w:r>
             <w:proofErr w:type="spellEnd"/>
-            <w:r>
-              <w:t xml:space="preserve"> </w:t>
-            </w:r>
             <w:proofErr w:type="spellStart"/>
-            <w:r>
-              <w:t>суммарная</w:t>
-            </w:r>
             <w:proofErr w:type="spellEnd"/>
-            <w:r>
-              <w:t xml:space="preserve"> </w:t>
-            </w:r>
             <w:proofErr w:type="spellStart"/>
-            <w:r>
-              <w:t>сила</w:t>
-            </w:r>
             <w:proofErr w:type="spellEnd"/>
           </w:p>
         </w:tc>
@@ -3909,7 +2121,7 @@
           </w:tcPr>
           <w:p>
             <w:r>
-              <w:t>Да при pair_scatter</w:t>
+              <w:t>Yes with pair_scatter</w:t>
             </w:r>
           </w:p>
         </w:tc>
@@ -3933,37 +2145,7 @@
               <w:rPr>
                 <w:lang w:val="ru-RU"/>
               </w:rPr>
-              <w:t xml:space="preserve">Следует из </w:t>
-            </w:r>
-            <w:r>
-              <w:rPr>
-                <w:lang w:val="ru-RU"/>
-              </w:rPr>
-              <w:t>архитектуры определения ускорений</w:t>
-            </w:r>
-            <w:r>
-              <w:rPr>
-                <w:lang w:val="ru-RU"/>
-              </w:rPr>
-              <w:t xml:space="preserve"> +</w:t>
-            </w:r>
-            <w:r>
-              <w:t>a</w:t>
-            </w:r>
-            <w:r>
-              <w:rPr>
-                <w:lang w:val="ru-RU"/>
-              </w:rPr>
-              <w:t xml:space="preserve"> и -</w:t>
-            </w:r>
-            <w:r>
-              <w:t>a</w:t>
-            </w:r>
-            <w:r>
-              <w:rPr>
-                <w:lang w:val="ru-RU"/>
-              </w:rPr>
-              <w:t>.</w:t>
+              <w:t>Follows from the acceleration construction +a and -a.</w:t>
             </w:r>
           </w:p>
         </w:tc>
@@ -3982,7 +2164,7 @@
           <w:p>
             <w:proofErr w:type="spellStart"/>
             <w:r>
-              <w:t>Потенциальность</w:t>
+              <w:t>Potentiality</w:t>
             </w:r>
             <w:proofErr w:type="spellEnd"/>
           </w:p>
@@ -3999,7 +2181,7 @@
           </w:tcPr>
           <w:p>
             <w:r>
-              <w:t>Частично</w:t>
+              <w:t>Partial</w:t>
             </w:r>
           </w:p>
         </w:tc>
@@ -4023,13 +2205,7 @@
               <w:rPr>
                 <w:lang w:val="ru-RU"/>
               </w:rPr>
-              <w:t xml:space="preserve">Силы берутся из градиента энергии при </w:t>
-            </w:r>
-            <w:r>
-              <w:rPr>
-                <w:lang w:val="ru-RU"/>
-              </w:rPr>
-              <w:t>фиксированной истории.</w:t>
+              <w:t>Forces are taken from the energy gradient for a fixed history.</w:t>
             </w:r>
           </w:p>
         </w:tc>
@@ -4048,24 +2224,12 @@
           <w:p>
             <w:proofErr w:type="spellStart"/>
             <w:r>
-              <w:t>Обычная</w:t>
+              <w:t>Ordinary static energy</w:t>
             </w:r>
             <w:proofErr w:type="spellEnd"/>
-            <w:r>
-              <w:t xml:space="preserve"> </w:t>
-            </w:r>
             <w:proofErr w:type="spellStart"/>
-            <w:r>
-              <w:t>статическая</w:t>
-            </w:r>
             <w:proofErr w:type="spellEnd"/>
-            <w:r>
-              <w:t xml:space="preserve"> </w:t>
-            </w:r>
             <w:proofErr w:type="spellStart"/>
-            <w:r>
-              <w:t>энергия</w:t>
-            </w:r>
             <w:proofErr w:type="spellEnd"/>
           </w:p>
         </w:tc>
@@ -4081,7 +2245,7 @@
           </w:tcPr>
           <w:p>
             <w:r>
-              <w:t>Нет</w:t>
+              <w:t>No</w:t>
             </w:r>
           </w:p>
         </w:tc>
@@ -4102,13 +2266,7 @@
               </w:rPr>
             </w:pPr>
             <w:r>
-              <w:t>RNN</w:t>
-            </w:r>
-            <w:r>
-              <w:rPr>
-                <w:lang w:val="ru-RU"/>
-              </w:rPr>
-              <w:t xml:space="preserve"> использует историю, поэтому энергия эффективная и динамическая.</w:t>
+              <w:t>The RNN uses history, so the energy is effective and dynamical.</w:t>
             </w:r>
           </w:p>
         </w:tc>
@@ -4134,13 +2292,7 @@
               <w:rPr>
                 <w:lang w:val="ru-RU"/>
               </w:rPr>
-              <w:t>Перенос 333 -&gt; 1055</w:t>
-            </w:r>
-            <w:r>
-              <w:rPr>
-                <w:lang w:val="ru-RU"/>
-              </w:rPr>
-              <w:t xml:space="preserve"> (и вообще на любой другой размер)</w:t>
+              <w:t>Transfer 333 -&gt; 1055 (and generally to any other size)</w:t>
             </w:r>
           </w:p>
         </w:tc>
@@ -4157,22 +2309,10 @@
           <w:p>
             <w:proofErr w:type="spellStart"/>
             <w:r>
-              <w:t>Предполагаем</w:t>
+              <w:t>Intended mode</w:t>
             </w:r>
             <w:proofErr w:type="spellEnd"/>
-            <w:r>
-              <w:rPr>
-                <w:lang w:val="ru-RU"/>
-              </w:rPr>
-              <w:t>ы</w:t>
-            </w:r>
-            <w:r>
-              <w:t xml:space="preserve">й </w:t>
-            </w:r>
             <w:proofErr w:type="spellStart"/>
-            <w:r>
-              <w:t>режим</w:t>
-            </w:r>
             <w:proofErr w:type="spellEnd"/>
           </w:p>
         </w:tc>
@@ -4196,75 +2336,12 @@
               <w:rPr>
                 <w:lang w:val="ru-RU"/>
               </w:rPr>
-              <w:t xml:space="preserve">Проверяется через </w:t>
+              <w:t>Checked by inference on the 1055 crystal and S(q,w)/energy diagnostics.</w:t>
             </w:r>
             <w:proofErr w:type="spellStart"/>
-            <w:r>
-              <w:rPr>
-                <w:lang w:val="ru-RU"/>
-              </w:rPr>
-              <w:t>инференс</w:t>
-            </w:r>
             <w:proofErr w:type="spellEnd"/>
-            <w:r>
-              <w:rPr>
-                <w:lang w:val="ru-RU"/>
-              </w:rPr>
-              <w:t xml:space="preserve"> на 1055 кристалле</w:t>
-            </w:r>
-            <w:r>
-              <w:rPr>
-                <w:lang w:val="ru-RU"/>
-              </w:rPr>
-              <w:t xml:space="preserve"> и </w:t>
-            </w:r>
-            <w:r>
-              <w:t>S</w:t>
-            </w:r>
-            <w:r>
-              <w:rPr>
-                <w:lang w:val="ru-RU"/>
-              </w:rPr>
-              <w:t>(</w:t>
-            </w:r>
             <w:proofErr w:type="gramStart"/>
-            <w:r>
-              <w:t>q</w:t>
-            </w:r>
-            <w:r>
-              <w:rPr>
-                <w:lang w:val="ru-RU"/>
-              </w:rPr>
-              <w:t>,</w:t>
-            </w:r>
-            <w:r>
-              <w:t>w</w:t>
-            </w:r>
             <w:proofErr w:type="gramEnd"/>
-            <w:r>
-              <w:rPr>
-                <w:lang w:val="ru-RU"/>
-              </w:rPr>
-              <w:t>)/</w:t>
-            </w:r>
-            <w:r>
-              <w:t>energy</w:t>
-            </w:r>
-            <w:r>
-              <w:rPr>
-                <w:lang w:val="ru-RU"/>
-              </w:rPr>
-              <w:t xml:space="preserve"> </w:t>
-            </w:r>
-            <w:r>
-              <w:t>diagnostics</w:t>
-            </w:r>
-            <w:r>
-              <w:rPr>
-                <w:lang w:val="ru-RU"/>
-              </w:rPr>
-              <w:t>.</w:t>
-            </w:r>
           </w:p>
         </w:tc>
       </w:tr>
@@ -4287,31 +2364,7 @@
         <w:rPr>
           <w:lang w:val="ru-RU"/>
         </w:rPr>
-        <w:t>9. Текущий р</w:t>
-      </w:r>
-      <w:r>
-        <w:rPr>
-          <w:lang w:val="ru-RU"/>
-        </w:rPr>
-        <w:t xml:space="preserve">екомендуемый </w:t>
-      </w:r>
-      <w:r>
-        <w:t>pipeline</w:t>
-      </w:r>
-      <w:r>
-        <w:rPr>
-          <w:lang w:val="ru-RU"/>
-        </w:rPr>
-        <w:t xml:space="preserve"> (ключи скриптов и их смысл в </w:t>
-      </w:r>
-      <w:r>
-        <w:t>readme</w:t>
-      </w:r>
-      <w:r>
-        <w:rPr>
-          <w:lang w:val="ru-RU"/>
-        </w:rPr>
-        <w:t>)</w:t>
+        <w:t>9. Current recommended pipeline (script options and their meanings are documented in README)</w:t>
       </w:r>
     </w:p>
     <w:p>
@@ -4320,27 +2373,18 @@
       </w:pPr>
       <w:proofErr w:type="spellStart"/>
       <w:r>
-        <w:t>Подготовить</w:t>
+        <w:t>Prepare force-enabled data333_force.npz from a LAMMPS dump.</w:t>
       </w:r>
       <w:proofErr w:type="spellEnd"/>
-      <w:r>
-        <w:t xml:space="preserve"> force-enabled data333_force.npz </w:t>
-      </w:r>
       <w:proofErr w:type="spellStart"/>
-      <w:r>
-        <w:t>из</w:t>
-      </w:r>
       <w:proofErr w:type="spellEnd"/>
-      <w:r>
-        <w:t xml:space="preserve"> LAMMPS dump.</w:t>
-      </w:r>
     </w:p>
     <w:p>
       <w:pPr>
         <w:pStyle w:val="a"/>
       </w:pPr>
       <w:r>
-        <w:t>Запустить pipelines/pair_energy/cluster/submit_search.py для серии моделей.</w:t>
+        <w:t>Run pipelines/pair_energy/cluster/submit_search.py for a model series.</w:t>
       </w:r>
     </w:p>
     <w:p>
@@ -4354,64 +2398,10 @@
         <w:rPr>
           <w:lang w:val="ru-RU"/>
         </w:rPr>
-        <w:t xml:space="preserve">Выбрать модель по </w:t>
-      </w:r>
-      <w:r>
-        <w:t>S</w:t>
-      </w:r>
-      <w:r>
-        <w:rPr>
-          <w:lang w:val="ru-RU"/>
-        </w:rPr>
-        <w:t>(</w:t>
+        <w:t>Select a model using S(q,w), velocity/acceleration diagnostics, and energy checks.</w:t>
       </w:r>
       <w:proofErr w:type="gramStart"/>
-      <w:r>
-        <w:t>q</w:t>
-      </w:r>
-      <w:r>
-        <w:rPr>
-          <w:lang w:val="ru-RU"/>
-        </w:rPr>
-        <w:t>,</w:t>
-      </w:r>
-      <w:r>
-        <w:t>w</w:t>
-      </w:r>
       <w:proofErr w:type="gramEnd"/>
-      <w:r>
-        <w:rPr>
-          <w:lang w:val="ru-RU"/>
-        </w:rPr>
-        <w:t xml:space="preserve">), </w:t>
-      </w:r>
-      <w:r>
-        <w:t>velocity</w:t>
-      </w:r>
-      <w:r>
-        <w:rPr>
-          <w:lang w:val="ru-RU"/>
-        </w:rPr>
-        <w:t>/</w:t>
-      </w:r>
-      <w:r>
-        <w:t>acceleration</w:t>
-      </w:r>
-      <w:r>
-        <w:rPr>
-          <w:lang w:val="ru-RU"/>
-        </w:rPr>
-        <w:t xml:space="preserve"> </w:t>
-      </w:r>
-      <w:r>
-        <w:t>diagnostics</w:t>
-      </w:r>
-      <w:r>
-        <w:rPr>
-          <w:lang w:val="ru-RU"/>
-        </w:rPr>
-        <w:t xml:space="preserve"> и энергетическим проверкам.</w:t>
-      </w:r>
     </w:p>
     <w:p>
       <w:pPr>
@@ -4419,27 +2409,18 @@
       </w:pPr>
       <w:proofErr w:type="spellStart"/>
       <w:r>
-        <w:t>Запустить</w:t>
+        <w:t>Run pipelines/pair_energy/cluster/submit_inference_1055.py on data1055.npz.</w:t>
       </w:r>
       <w:proofErr w:type="spellEnd"/>
-      <w:r>
-        <w:t xml:space="preserve"> pipelines/pair_energy/cluster/submit_inference_1055.py </w:t>
-      </w:r>
       <w:proofErr w:type="spellStart"/>
-      <w:r>
-        <w:t>на</w:t>
-      </w:r>
       <w:proofErr w:type="spellEnd"/>
-      <w:r>
-        <w:t xml:space="preserve"> data1055.npz.</w:t>
-      </w:r>
     </w:p>
     <w:p>
       <w:pPr>
         <w:pStyle w:val="a"/>
       </w:pPr>
       <w:r>
-        <w:t>Смотреть S(q,w), temperature trace, velocity histograms, phase power/acceleration, canonical checks, sound speed, path-energy и direct E_tot/Cv diagnostics.</w:t>
+        <w:t>Inspect S(q,w), temperature trace, velocity histograms, phase power/acceleration, canonical checks, sound speed, path-energy, and direct E_tot/Cv diagnostics.</w:t>
       </w:r>
     </w:p>
     <w:p>
@@ -5403,7 +3384,7 @@
     </w:pPr>
   </w:style>
   <w:style w:type="character" w:customStyle="1" w:styleId="a6">
-    <w:name w:val="Верхний колонтитул Знак"/>
+    <w:name w:val="Header Char"/>
     <w:basedOn w:val="a2"/>
     <w:link w:val="a5"/>
     <w:uiPriority w:val="99"/>
@@ -5425,7 +3406,7 @@
     </w:pPr>
   </w:style>
   <w:style w:type="character" w:customStyle="1" w:styleId="a8">
-    <w:name w:val="Нижний колонтитул Знак"/>
+    <w:name w:val="Footer Char"/>
     <w:basedOn w:val="a2"/>
     <w:link w:val="a7"/>
     <w:uiPriority w:val="99"/>
@@ -5441,7 +3422,7 @@
     </w:pPr>
   </w:style>
   <w:style w:type="character" w:customStyle="1" w:styleId="10">
-    <w:name w:val="Заголовок 1 Знак"/>
+    <w:name w:val="Heading 1 Char"/>
     <w:basedOn w:val="a2"/>
     <w:link w:val="1"/>
     <w:uiPriority w:val="9"/>
@@ -5456,7 +3437,7 @@
     </w:rPr>
   </w:style>
   <w:style w:type="character" w:customStyle="1" w:styleId="22">
-    <w:name w:val="Заголовок 2 Знак"/>
+    <w:name w:val="Heading 2 Char"/>
     <w:basedOn w:val="a2"/>
     <w:link w:val="21"/>
     <w:uiPriority w:val="9"/>
@@ -5471,7 +3452,7 @@
     </w:rPr>
   </w:style>
   <w:style w:type="character" w:customStyle="1" w:styleId="32">
-    <w:name w:val="Заголовок 3 Знак"/>
+    <w:name w:val="Heading 3 Char"/>
     <w:basedOn w:val="a2"/>
     <w:link w:val="31"/>
     <w:uiPriority w:val="9"/>
@@ -5508,7 +3489,7 @@
     </w:rPr>
   </w:style>
   <w:style w:type="character" w:customStyle="1" w:styleId="ab">
-    <w:name w:val="Заголовок Знак"/>
+    <w:name w:val="Title Char"/>
     <w:basedOn w:val="a2"/>
     <w:link w:val="aa"/>
     <w:uiPriority w:val="10"/>
@@ -5546,7 +3527,7 @@
     </w:rPr>
   </w:style>
   <w:style w:type="character" w:customStyle="1" w:styleId="ad">
-    <w:name w:val="Подзаголовок Знак"/>
+    <w:name w:val="Subtitle Char"/>
     <w:basedOn w:val="a2"/>
     <w:link w:val="ac"/>
     <w:uiPriority w:val="11"/>
@@ -5581,7 +3562,7 @@
     <w:rsid w:val="00AA1D8D"/>
   </w:style>
   <w:style w:type="character" w:customStyle="1" w:styleId="af0">
-    <w:name w:val="Основной текст Знак"/>
+    <w:name w:val="Body Text Char"/>
     <w:basedOn w:val="a2"/>
     <w:link w:val="af"/>
     <w:uiPriority w:val="99"/>
@@ -5599,7 +3580,7 @@
     </w:pPr>
   </w:style>
   <w:style w:type="character" w:customStyle="1" w:styleId="24">
-    <w:name w:val="Основной текст 2 Знак"/>
+    <w:name w:val="Body Text 2 Char"/>
     <w:basedOn w:val="a2"/>
     <w:link w:val="23"/>
     <w:uiPriority w:val="99"/>
@@ -5618,7 +3599,7 @@
     </w:rPr>
   </w:style>
   <w:style w:type="character" w:customStyle="1" w:styleId="34">
-    <w:name w:val="Основной текст 3 Знак"/>
+    <w:name w:val="Body Text 3 Char"/>
     <w:basedOn w:val="a2"/>
     <w:link w:val="33"/>
     <w:uiPriority w:val="99"/>
@@ -5798,7 +3779,7 @@
     </w:rPr>
   </w:style>
   <w:style w:type="character" w:customStyle="1" w:styleId="af4">
-    <w:name w:val="Текст макроса Знак"/>
+    <w:name w:val="Macro Text Char"/>
     <w:basedOn w:val="a2"/>
     <w:link w:val="af3"/>
     <w:uiPriority w:val="99"/>
@@ -5824,7 +3805,7 @@
     </w:rPr>
   </w:style>
   <w:style w:type="character" w:customStyle="1" w:styleId="28">
-    <w:name w:val="Цитата 2 Знак"/>
+    <w:name w:val="Quote 2 Char"/>
     <w:basedOn w:val="a2"/>
     <w:link w:val="27"/>
     <w:uiPriority w:val="29"/>
@@ -5836,7 +3817,7 @@
     </w:rPr>
   </w:style>
   <w:style w:type="character" w:customStyle="1" w:styleId="40">
-    <w:name w:val="Заголовок 4 Знак"/>
+    <w:name w:val="Heading 4 Char"/>
     <w:basedOn w:val="a2"/>
     <w:link w:val="4"/>
     <w:uiPriority w:val="9"/>
@@ -5852,7 +3833,7 @@
     </w:rPr>
   </w:style>
   <w:style w:type="character" w:customStyle="1" w:styleId="50">
-    <w:name w:val="Заголовок 5 Знак"/>
+    <w:name w:val="Heading 5 Char"/>
     <w:basedOn w:val="a2"/>
     <w:link w:val="5"/>
     <w:uiPriority w:val="9"/>
@@ -5864,7 +3845,7 @@
     </w:rPr>
   </w:style>
   <w:style w:type="character" w:customStyle="1" w:styleId="60">
-    <w:name w:val="Заголовок 6 Знак"/>
+    <w:name w:val="Heading 6 Char"/>
     <w:basedOn w:val="a2"/>
     <w:link w:val="6"/>
     <w:uiPriority w:val="9"/>
@@ -5878,7 +3859,7 @@
     </w:rPr>
   </w:style>
   <w:style w:type="character" w:customStyle="1" w:styleId="70">
-    <w:name w:val="Заголовок 7 Знак"/>
+    <w:name w:val="Heading 7 Char"/>
     <w:basedOn w:val="a2"/>
     <w:link w:val="7"/>
     <w:uiPriority w:val="9"/>
@@ -5892,7 +3873,7 @@
     </w:rPr>
   </w:style>
   <w:style w:type="character" w:customStyle="1" w:styleId="80">
-    <w:name w:val="Заголовок 8 Знак"/>
+    <w:name w:val="Heading 8 Char"/>
     <w:basedOn w:val="a2"/>
     <w:link w:val="8"/>
     <w:uiPriority w:val="9"/>
@@ -5906,7 +3887,7 @@
     </w:rPr>
   </w:style>
   <w:style w:type="character" w:customStyle="1" w:styleId="90">
-    <w:name w:val="Заголовок 9 Знак"/>
+    <w:name w:val="Heading 9 Char"/>
     <w:basedOn w:val="a2"/>
     <w:link w:val="9"/>
     <w:uiPriority w:val="9"/>
@@ -5987,7 +3968,7 @@
     </w:rPr>
   </w:style>
   <w:style w:type="character" w:customStyle="1" w:styleId="af9">
-    <w:name w:val="Выделенная цитата Знак"/>
+    <w:name w:val="Intense Quote Char"/>
     <w:basedOn w:val="a2"/>
     <w:link w:val="af8"/>
     <w:uiPriority w:val="30"/>

</xml_diff>